<commit_message>
přidána fuknce posouvání bodů. mazání bodů WIP
</commit_message>
<xml_diff>
--- a/doc/PozadavkyPGRF1_Task1_2026.docx
+++ b/doc/PozadavkyPGRF1_Task1_2026.docx
@@ -298,7 +298,27 @@
                 <w:szCs w:val="24"/>
                 <w:lang w:eastAsia="cs-CZ"/>
               </w:rPr>
-              <w:t>Správná rasterizace ve všech kvadrantech</w:t>
+              <w:t xml:space="preserve">Správná </w:t>
+            </w:r>
+            <w:proofErr w:type="spellStart"/>
+            <w:r>
+              <w:rPr>
+                <w:rFonts w:ascii="Arial" w:eastAsia="Times New Roman" w:hAnsi="Arial" w:cs="Arial"/>
+                <w:sz w:val="20"/>
+                <w:szCs w:val="24"/>
+                <w:lang w:eastAsia="cs-CZ"/>
+              </w:rPr>
+              <w:t>rasterizace</w:t>
+            </w:r>
+            <w:proofErr w:type="spellEnd"/>
+            <w:r>
+              <w:rPr>
+                <w:rFonts w:ascii="Arial" w:eastAsia="Times New Roman" w:hAnsi="Arial" w:cs="Arial"/>
+                <w:sz w:val="20"/>
+                <w:szCs w:val="24"/>
+                <w:lang w:eastAsia="cs-CZ"/>
+              </w:rPr>
+              <w:t xml:space="preserve"> ve všech kvadrantech</w:t>
             </w:r>
             <w:r>
               <w:rPr>
@@ -330,6 +350,7 @@
                 <w:lang w:eastAsia="cs-CZ"/>
               </w:rPr>
             </w:pPr>
+            <w:proofErr w:type="gramStart"/>
             <w:r>
               <w:rPr>
                 <w:rFonts w:ascii="Arial" w:eastAsia="Times New Roman" w:hAnsi="Arial" w:cs="Arial"/>
@@ -340,6 +361,7 @@
               </w:rPr>
               <w:t>100%</w:t>
             </w:r>
+            <w:proofErr w:type="gramEnd"/>
           </w:p>
         </w:tc>
         <w:tc>
@@ -407,6 +429,7 @@
         </w:trPr>
         <w:tc>
           <w:tcPr>
+            <w:cnfStyle w:val="001000000000" w:firstRow="0" w:lastRow="0" w:firstColumn="1" w:lastColumn="0" w:oddVBand="0" w:evenVBand="0" w:oddHBand="0" w:evenHBand="0" w:firstRowFirstColumn="0" w:firstRowLastColumn="0" w:lastRowFirstColumn="0" w:lastRowLastColumn="0"/>
             <w:tcW w:w="1980" w:type="dxa"/>
             <w:vMerge/>
             <w:shd w:val="clear" w:color="auto" w:fill="FFFFFF" w:themeFill="background1"/>
@@ -415,7 +438,6 @@
           </w:tcPr>
           <w:p>
             <w:pPr>
-              <w:cnfStyle w:val="001000000000" w:firstRow="0" w:lastRow="0" w:firstColumn="1" w:lastColumn="0" w:oddVBand="0" w:evenVBand="0" w:oddHBand="0" w:evenHBand="0" w:firstRowFirstColumn="0" w:firstRowLastColumn="0" w:lastRowFirstColumn="0" w:lastRowLastColumn="0"/>
               <w:rPr>
                 <w:rFonts w:ascii="Arial" w:eastAsia="Times New Roman" w:hAnsi="Arial" w:cs="Arial"/>
                 <w:b w:val="0"/>
@@ -434,22 +456,34 @@
           </w:tcPr>
           <w:p>
             <w:pPr>
-              <w:rPr>
-                <w:rFonts w:ascii="Arial" w:eastAsia="Times New Roman" w:hAnsi="Arial" w:cs="Arial"/>
-                <w:sz w:val="20"/>
-                <w:szCs w:val="24"/>
-                <w:lang w:eastAsia="cs-CZ"/>
-              </w:rPr>
-            </w:pPr>
-            <w:r>
-              <w:rPr>
-                <w:rFonts w:ascii="Arial" w:eastAsia="Times New Roman" w:hAnsi="Arial" w:cs="Arial"/>
-                <w:sz w:val="20"/>
-                <w:szCs w:val="24"/>
-                <w:lang w:eastAsia="cs-CZ"/>
-              </w:rPr>
-              <w:t>Označení algoritmu rasterizace</w:t>
-            </w:r>
+              <w:cnfStyle w:val="000000000000" w:firstRow="0" w:lastRow="0" w:firstColumn="0" w:lastColumn="0" w:oddVBand="0" w:evenVBand="0" w:oddHBand="0" w:evenHBand="0" w:firstRowFirstColumn="0" w:firstRowLastColumn="0" w:lastRowFirstColumn="0" w:lastRowLastColumn="0"/>
+              <w:rPr>
+                <w:rFonts w:ascii="Arial" w:eastAsia="Times New Roman" w:hAnsi="Arial" w:cs="Arial"/>
+                <w:sz w:val="20"/>
+                <w:szCs w:val="24"/>
+                <w:lang w:eastAsia="cs-CZ"/>
+              </w:rPr>
+            </w:pPr>
+            <w:r>
+              <w:rPr>
+                <w:rFonts w:ascii="Arial" w:eastAsia="Times New Roman" w:hAnsi="Arial" w:cs="Arial"/>
+                <w:sz w:val="20"/>
+                <w:szCs w:val="24"/>
+                <w:lang w:eastAsia="cs-CZ"/>
+              </w:rPr>
+              <w:t xml:space="preserve">Označení algoritmu </w:t>
+            </w:r>
+            <w:proofErr w:type="spellStart"/>
+            <w:r>
+              <w:rPr>
+                <w:rFonts w:ascii="Arial" w:eastAsia="Times New Roman" w:hAnsi="Arial" w:cs="Arial"/>
+                <w:sz w:val="20"/>
+                <w:szCs w:val="24"/>
+                <w:lang w:eastAsia="cs-CZ"/>
+              </w:rPr>
+              <w:t>rasterizace</w:t>
+            </w:r>
+            <w:proofErr w:type="spellEnd"/>
             <w:r>
               <w:rPr>
                 <w:rFonts w:ascii="Arial" w:eastAsia="Times New Roman" w:hAnsi="Arial" w:cs="Arial"/>
@@ -498,6 +532,7 @@
           <w:p>
             <w:pPr>
               <w:jc w:val="center"/>
+              <w:cnfStyle w:val="000000000000" w:firstRow="0" w:lastRow="0" w:firstColumn="0" w:lastColumn="0" w:oddVBand="0" w:evenVBand="0" w:oddHBand="0" w:evenHBand="0" w:firstRowFirstColumn="0" w:firstRowLastColumn="0" w:lastRowFirstColumn="0" w:lastRowLastColumn="0"/>
               <w:rPr>
                 <w:rFonts w:ascii="Arial" w:eastAsia="Times New Roman" w:hAnsi="Arial" w:cs="Arial"/>
                 <w:sz w:val="20"/>
@@ -506,6 +541,7 @@
                 <w:lang w:eastAsia="cs-CZ"/>
               </w:rPr>
             </w:pPr>
+            <w:proofErr w:type="gramStart"/>
             <w:r>
               <w:rPr>
                 <w:rFonts w:ascii="Arial" w:eastAsia="Times New Roman" w:hAnsi="Arial" w:cs="Arial"/>
@@ -516,6 +552,7 @@
               </w:rPr>
               <w:t>100%</w:t>
             </w:r>
+            <w:proofErr w:type="gramEnd"/>
           </w:p>
         </w:tc>
         <w:tc>
@@ -528,6 +565,7 @@
           <w:p>
             <w:pPr>
               <w:jc w:val="center"/>
+              <w:cnfStyle w:val="000000000000" w:firstRow="0" w:lastRow="0" w:firstColumn="0" w:lastColumn="0" w:oddVBand="0" w:evenVBand="0" w:oddHBand="0" w:evenHBand="0" w:firstRowFirstColumn="0" w:firstRowLastColumn="0" w:lastRowFirstColumn="0" w:lastRowLastColumn="0"/>
               <w:rPr>
                 <w:rFonts w:ascii="Times New Roman" w:eastAsia="Times New Roman" w:hAnsi="Times New Roman" w:cs="Times New Roman"/>
                 <w:sz w:val="20"/>
@@ -546,6 +584,7 @@
           </w:tcPr>
           <w:p>
             <w:pPr>
+              <w:cnfStyle w:val="000000000000" w:firstRow="0" w:lastRow="0" w:firstColumn="0" w:lastColumn="0" w:oddVBand="0" w:evenVBand="0" w:oddHBand="0" w:evenHBand="0" w:firstRowFirstColumn="0" w:firstRowLastColumn="0" w:lastRowFirstColumn="0" w:lastRowLastColumn="0"/>
               <w:rPr>
                 <w:rFonts w:ascii="Times New Roman" w:eastAsia="Times New Roman" w:hAnsi="Times New Roman" w:cs="Times New Roman"/>
                 <w:sz w:val="20"/>
@@ -646,6 +685,7 @@
                 <w:lang w:eastAsia="cs-CZ"/>
               </w:rPr>
             </w:pPr>
+            <w:proofErr w:type="gramStart"/>
             <w:r>
               <w:rPr>
                 <w:rFonts w:ascii="Arial" w:eastAsia="Times New Roman" w:hAnsi="Arial" w:cs="Arial"/>
@@ -656,6 +696,7 @@
               </w:rPr>
               <w:t>100%</w:t>
             </w:r>
+            <w:proofErr w:type="gramEnd"/>
           </w:p>
         </w:tc>
         <w:tc>
@@ -712,7 +753,27 @@
                 <w:szCs w:val="20"/>
                 <w:lang w:eastAsia="cs-CZ"/>
               </w:rPr>
-              <w:t>Ošetřeno přidávání bodů do jednoho objektu dokud není ukončen</w:t>
+              <w:t xml:space="preserve">Ošetřeno přidávání bodů do jednoho </w:t>
+            </w:r>
+            <w:proofErr w:type="gramStart"/>
+            <w:r>
+              <w:rPr>
+                <w:rFonts w:ascii="Times New Roman" w:eastAsia="Times New Roman" w:hAnsi="Times New Roman" w:cs="Times New Roman"/>
+                <w:sz w:val="20"/>
+                <w:szCs w:val="20"/>
+                <w:lang w:eastAsia="cs-CZ"/>
+              </w:rPr>
+              <w:t>objektu</w:t>
+            </w:r>
+            <w:proofErr w:type="gramEnd"/>
+            <w:r>
+              <w:rPr>
+                <w:rFonts w:ascii="Times New Roman" w:eastAsia="Times New Roman" w:hAnsi="Times New Roman" w:cs="Times New Roman"/>
+                <w:sz w:val="20"/>
+                <w:szCs w:val="20"/>
+                <w:lang w:eastAsia="cs-CZ"/>
+              </w:rPr>
+              <w:t xml:space="preserve"> dokud není ukončen</w:t>
             </w:r>
           </w:p>
         </w:tc>
@@ -794,6 +855,7 @@
                 <w:lang w:eastAsia="cs-CZ"/>
               </w:rPr>
             </w:pPr>
+            <w:proofErr w:type="gramStart"/>
             <w:r>
               <w:rPr>
                 <w:rFonts w:ascii="Arial" w:eastAsia="Times New Roman" w:hAnsi="Arial" w:cs="Arial"/>
@@ -804,6 +866,7 @@
               </w:rPr>
               <w:t>100%</w:t>
             </w:r>
+            <w:proofErr w:type="gramEnd"/>
           </w:p>
         </w:tc>
         <w:tc>
@@ -923,6 +986,7 @@
                 <w:lang w:eastAsia="cs-CZ"/>
               </w:rPr>
             </w:pPr>
+            <w:proofErr w:type="gramStart"/>
             <w:r>
               <w:rPr>
                 <w:rFonts w:ascii="Arial" w:eastAsia="Times New Roman" w:hAnsi="Arial" w:cs="Arial"/>
@@ -933,6 +997,7 @@
               </w:rPr>
               <w:t>90%</w:t>
             </w:r>
+            <w:proofErr w:type="gramEnd"/>
           </w:p>
         </w:tc>
         <w:tc>
@@ -977,7 +1042,52 @@
                 <w:szCs w:val="20"/>
                 <w:lang w:eastAsia="cs-CZ"/>
               </w:rPr>
-              <w:t>Využití abstraktní třídy i rozhraní. Úsečka nemá vlastní datovou strukturu, pro z důvodu snadnější implementace využívá třídu Polygon</w:t>
+              <w:t>Využití abstraktní třídy i rozhraní</w:t>
+            </w:r>
+            <w:r>
+              <w:rPr>
+                <w:rFonts w:ascii="Times New Roman" w:eastAsia="Times New Roman" w:hAnsi="Times New Roman" w:cs="Times New Roman"/>
+                <w:sz w:val="20"/>
+                <w:szCs w:val="20"/>
+                <w:lang w:eastAsia="cs-CZ"/>
+              </w:rPr>
+              <w:t xml:space="preserve"> pro vykreslení</w:t>
+            </w:r>
+            <w:r>
+              <w:rPr>
+                <w:rFonts w:ascii="Times New Roman" w:eastAsia="Times New Roman" w:hAnsi="Times New Roman" w:cs="Times New Roman"/>
+                <w:sz w:val="20"/>
+                <w:szCs w:val="20"/>
+                <w:lang w:eastAsia="cs-CZ"/>
+              </w:rPr>
+              <w:t xml:space="preserve">. Úsečka </w:t>
+            </w:r>
+            <w:r>
+              <w:rPr>
+                <w:rFonts w:ascii="Times New Roman" w:eastAsia="Times New Roman" w:hAnsi="Times New Roman" w:cs="Times New Roman"/>
+                <w:sz w:val="20"/>
+                <w:szCs w:val="20"/>
+                <w:lang w:eastAsia="cs-CZ"/>
+              </w:rPr>
+              <w:t xml:space="preserve">samotná </w:t>
+            </w:r>
+            <w:r>
+              <w:rPr>
+                <w:rFonts w:ascii="Times New Roman" w:eastAsia="Times New Roman" w:hAnsi="Times New Roman" w:cs="Times New Roman"/>
+                <w:sz w:val="20"/>
+                <w:szCs w:val="20"/>
+                <w:lang w:eastAsia="cs-CZ"/>
+              </w:rPr>
+              <w:t>nemá vlastní datovou strukturu, z důvodu snadnější implementace využívá třídu Polygon</w:t>
+            </w:r>
+            <w:r>
+              <w:rPr>
+                <w:rFonts w:ascii="Times New Roman" w:eastAsia="Times New Roman" w:hAnsi="Times New Roman" w:cs="Times New Roman"/>
+                <w:sz w:val="20"/>
+                <w:szCs w:val="20"/>
+                <w:lang w:eastAsia="cs-CZ"/>
+              </w:rPr>
+              <w:t xml:space="preserve"> (polygon s dvěma body)</w:t>
             </w:r>
           </w:p>
         </w:tc>
@@ -988,6 +1098,7 @@
         </w:trPr>
         <w:tc>
           <w:tcPr>
+            <w:cnfStyle w:val="001000000000" w:firstRow="0" w:lastRow="0" w:firstColumn="1" w:lastColumn="0" w:oddVBand="0" w:evenVBand="0" w:oddHBand="0" w:evenHBand="0" w:firstRowFirstColumn="0" w:firstRowLastColumn="0" w:lastRowFirstColumn="0" w:lastRowLastColumn="0"/>
             <w:tcW w:w="1980" w:type="dxa"/>
             <w:vMerge w:val="restart"/>
             <w:shd w:val="clear" w:color="auto" w:fill="FFFFFF" w:themeFill="background1"/>
@@ -996,7 +1107,6 @@
           </w:tcPr>
           <w:p>
             <w:pPr>
-              <w:cnfStyle w:val="001000000000" w:firstRow="0" w:lastRow="0" w:firstColumn="1" w:lastColumn="0" w:oddVBand="0" w:evenVBand="0" w:oddHBand="0" w:evenHBand="0" w:firstRowFirstColumn="0" w:firstRowLastColumn="0" w:lastRowFirstColumn="0" w:lastRowLastColumn="0"/>
               <w:rPr>
                 <w:rFonts w:ascii="Arial" w:eastAsia="Times New Roman" w:hAnsi="Arial" w:cs="Arial"/>
                 <w:bCs w:val="0"/>
@@ -1025,6 +1135,7 @@
           </w:tcPr>
           <w:p>
             <w:pPr>
+              <w:cnfStyle w:val="000000000000" w:firstRow="0" w:lastRow="0" w:firstColumn="0" w:lastColumn="0" w:oddVBand="0" w:evenVBand="0" w:oddHBand="0" w:evenHBand="0" w:firstRowFirstColumn="0" w:firstRowLastColumn="0" w:lastRowFirstColumn="0" w:lastRowLastColumn="0"/>
               <w:rPr>
                 <w:rFonts w:ascii="Arial" w:eastAsia="Times New Roman" w:hAnsi="Arial" w:cs="Arial"/>
                 <w:sz w:val="20"/>
@@ -1053,6 +1164,7 @@
           <w:p>
             <w:pPr>
               <w:jc w:val="center"/>
+              <w:cnfStyle w:val="000000000000" w:firstRow="0" w:lastRow="0" w:firstColumn="0" w:lastColumn="0" w:oddVBand="0" w:evenVBand="0" w:oddHBand="0" w:evenHBand="0" w:firstRowFirstColumn="0" w:firstRowLastColumn="0" w:lastRowFirstColumn="0" w:lastRowLastColumn="0"/>
               <w:rPr>
                 <w:rFonts w:ascii="Arial" w:eastAsia="Times New Roman" w:hAnsi="Arial" w:cs="Arial"/>
                 <w:sz w:val="20"/>
@@ -1061,6 +1173,7 @@
                 <w:lang w:eastAsia="cs-CZ"/>
               </w:rPr>
             </w:pPr>
+            <w:proofErr w:type="gramStart"/>
             <w:r>
               <w:rPr>
                 <w:rFonts w:ascii="Arial" w:eastAsia="Times New Roman" w:hAnsi="Arial" w:cs="Arial"/>
@@ -1071,6 +1184,7 @@
               </w:rPr>
               <w:t>100%</w:t>
             </w:r>
+            <w:proofErr w:type="gramEnd"/>
           </w:p>
         </w:tc>
         <w:tc>
@@ -1083,6 +1197,7 @@
           <w:p>
             <w:pPr>
               <w:jc w:val="center"/>
+              <w:cnfStyle w:val="000000000000" w:firstRow="0" w:lastRow="0" w:firstColumn="0" w:lastColumn="0" w:oddVBand="0" w:evenVBand="0" w:oddHBand="0" w:evenHBand="0" w:firstRowFirstColumn="0" w:firstRowLastColumn="0" w:lastRowFirstColumn="0" w:lastRowLastColumn="0"/>
               <w:rPr>
                 <w:rFonts w:ascii="Arial" w:eastAsia="Times New Roman" w:hAnsi="Arial" w:cs="Arial"/>
                 <w:sz w:val="20"/>
@@ -1101,21 +1216,51 @@
           </w:tcPr>
           <w:p>
             <w:pPr>
-              <w:rPr>
-                <w:rFonts w:ascii="Times New Roman" w:eastAsia="Times New Roman" w:hAnsi="Times New Roman" w:cs="Times New Roman"/>
-                <w:sz w:val="20"/>
-                <w:szCs w:val="20"/>
-                <w:lang w:eastAsia="cs-CZ"/>
-              </w:rPr>
-            </w:pPr>
-            <w:r>
-              <w:rPr>
-                <w:rFonts w:ascii="Times New Roman" w:eastAsia="Times New Roman" w:hAnsi="Times New Roman" w:cs="Times New Roman"/>
-                <w:sz w:val="20"/>
-                <w:szCs w:val="20"/>
-                <w:lang w:eastAsia="cs-CZ"/>
-              </w:rPr>
-              <w:t>Polygon si ukládá své body a stav (uzavřen/otevřen)</w:t>
+              <w:cnfStyle w:val="000000000000" w:firstRow="0" w:lastRow="0" w:firstColumn="0" w:lastColumn="0" w:oddVBand="0" w:evenVBand="0" w:oddHBand="0" w:evenHBand="0" w:firstRowFirstColumn="0" w:firstRowLastColumn="0" w:lastRowFirstColumn="0" w:lastRowLastColumn="0"/>
+              <w:rPr>
+                <w:rFonts w:ascii="Times New Roman" w:eastAsia="Times New Roman" w:hAnsi="Times New Roman" w:cs="Times New Roman"/>
+                <w:sz w:val="20"/>
+                <w:szCs w:val="20"/>
+                <w:lang w:eastAsia="cs-CZ"/>
+              </w:rPr>
+            </w:pPr>
+            <w:r>
+              <w:rPr>
+                <w:rFonts w:ascii="Times New Roman" w:eastAsia="Times New Roman" w:hAnsi="Times New Roman" w:cs="Times New Roman"/>
+                <w:sz w:val="20"/>
+                <w:szCs w:val="20"/>
+                <w:lang w:eastAsia="cs-CZ"/>
+              </w:rPr>
+              <w:t xml:space="preserve">Polygon si ukládá své body a stav </w:t>
+            </w:r>
+            <w:r>
+              <w:rPr>
+                <w:rFonts w:ascii="Times New Roman" w:eastAsia="Times New Roman" w:hAnsi="Times New Roman" w:cs="Times New Roman"/>
+                <w:sz w:val="20"/>
+                <w:szCs w:val="20"/>
+                <w:lang w:eastAsia="cs-CZ"/>
+              </w:rPr>
+              <w:t>(</w:t>
+            </w:r>
+            <w:proofErr w:type="spellStart"/>
+            <w:r>
+              <w:rPr>
+                <w:rFonts w:ascii="Times New Roman" w:eastAsia="Times New Roman" w:hAnsi="Times New Roman" w:cs="Times New Roman"/>
+                <w:sz w:val="20"/>
+                <w:szCs w:val="20"/>
+                <w:lang w:eastAsia="cs-CZ"/>
+              </w:rPr>
+              <w:t>isClosed</w:t>
+            </w:r>
+            <w:proofErr w:type="spellEnd"/>
+            <w:r>
+              <w:rPr>
+                <w:rFonts w:ascii="Times New Roman" w:eastAsia="Times New Roman" w:hAnsi="Times New Roman" w:cs="Times New Roman"/>
+                <w:sz w:val="20"/>
+                <w:szCs w:val="20"/>
+                <w:lang w:eastAsia="cs-CZ"/>
+              </w:rPr>
+              <w:t>)</w:t>
             </w:r>
           </w:p>
         </w:tc>
@@ -1217,7 +1362,47 @@
                 <w:highlight w:val="yellow"/>
                 <w:lang w:eastAsia="cs-CZ"/>
               </w:rPr>
-              <w:t>„animace“ kreslení čáry při pohybu myš</w:t>
+              <w:t>Levé tlačítko myši začne kreslení a přidává další body</w:t>
+            </w:r>
+            <w:r>
+              <w:rPr>
+                <w:rFonts w:ascii="Times New Roman" w:eastAsia="Times New Roman" w:hAnsi="Times New Roman" w:cs="Times New Roman"/>
+                <w:sz w:val="20"/>
+                <w:szCs w:val="20"/>
+                <w:highlight w:val="yellow"/>
+                <w:lang w:eastAsia="cs-CZ"/>
+              </w:rPr>
+              <w:t xml:space="preserve">. </w:t>
+            </w:r>
+            <w:r>
+              <w:rPr>
+                <w:rFonts w:ascii="Times New Roman" w:eastAsia="Times New Roman" w:hAnsi="Times New Roman" w:cs="Times New Roman"/>
+                <w:sz w:val="20"/>
+                <w:szCs w:val="20"/>
+                <w:highlight w:val="yellow"/>
+                <w:lang w:eastAsia="cs-CZ"/>
+              </w:rPr>
+              <w:t>„</w:t>
+            </w:r>
+            <w:r>
+              <w:rPr>
+                <w:rFonts w:ascii="Times New Roman" w:eastAsia="Times New Roman" w:hAnsi="Times New Roman" w:cs="Times New Roman"/>
+                <w:sz w:val="20"/>
+                <w:szCs w:val="20"/>
+                <w:highlight w:val="yellow"/>
+                <w:lang w:eastAsia="cs-CZ"/>
+              </w:rPr>
+              <w:t>A</w:t>
+            </w:r>
+            <w:r>
+              <w:rPr>
+                <w:rFonts w:ascii="Times New Roman" w:eastAsia="Times New Roman" w:hAnsi="Times New Roman" w:cs="Times New Roman"/>
+                <w:sz w:val="20"/>
+                <w:szCs w:val="20"/>
+                <w:highlight w:val="yellow"/>
+                <w:lang w:eastAsia="cs-CZ"/>
+              </w:rPr>
+              <w:t>nimace“ kreslení čáry při pohybu myš</w:t>
             </w:r>
             <w:r>
               <w:rPr>
@@ -1422,6 +1607,7 @@
                 <w:lang w:eastAsia="cs-CZ"/>
               </w:rPr>
             </w:pPr>
+            <w:proofErr w:type="gramStart"/>
             <w:r>
               <w:rPr>
                 <w:rFonts w:ascii="Times New Roman" w:eastAsia="Times New Roman" w:hAnsi="Times New Roman" w:cs="Times New Roman"/>
@@ -1432,6 +1618,7 @@
               </w:rPr>
               <w:t>100%</w:t>
             </w:r>
+            <w:proofErr w:type="gramEnd"/>
           </w:p>
         </w:tc>
         <w:tc>
@@ -1488,8 +1675,19 @@
                 <w:szCs w:val="20"/>
                 <w:lang w:eastAsia="cs-CZ"/>
               </w:rPr>
-              <w:t>Vymazání seznamu polygonů a vymazání rasteru</w:t>
-            </w:r>
+              <w:t xml:space="preserve">Vymazání seznamu polygonů a vymazání </w:t>
+            </w:r>
+            <w:proofErr w:type="spellStart"/>
+            <w:r>
+              <w:rPr>
+                <w:rFonts w:ascii="Times New Roman" w:eastAsia="Times New Roman" w:hAnsi="Times New Roman" w:cs="Times New Roman"/>
+                <w:sz w:val="20"/>
+                <w:szCs w:val="20"/>
+                <w:lang w:eastAsia="cs-CZ"/>
+              </w:rPr>
+              <w:t>rasteru</w:t>
+            </w:r>
+            <w:proofErr w:type="spellEnd"/>
           </w:p>
         </w:tc>
       </w:tr>
@@ -1865,14 +2063,45 @@
                 <w:lang w:eastAsia="cs-CZ"/>
               </w:rPr>
             </w:pPr>
-            <w:r>
-              <w:rPr>
-                <w:rFonts w:ascii="Arial" w:eastAsia="Times New Roman" w:hAnsi="Arial" w:cs="Arial"/>
-                <w:sz w:val="20"/>
-                <w:szCs w:val="24"/>
-                <w:lang w:eastAsia="cs-CZ"/>
-              </w:rPr>
-              <w:t>GITový repozitář s výsledným kódem</w:t>
+            <w:proofErr w:type="spellStart"/>
+            <w:r>
+              <w:rPr>
+                <w:rFonts w:ascii="Arial" w:eastAsia="Times New Roman" w:hAnsi="Arial" w:cs="Arial"/>
+                <w:sz w:val="20"/>
+                <w:szCs w:val="24"/>
+                <w:lang w:eastAsia="cs-CZ"/>
+              </w:rPr>
+              <w:t>GITový</w:t>
+            </w:r>
+            <w:proofErr w:type="spellEnd"/>
+            <w:r>
+              <w:rPr>
+                <w:rFonts w:ascii="Arial" w:eastAsia="Times New Roman" w:hAnsi="Arial" w:cs="Arial"/>
+                <w:sz w:val="20"/>
+                <w:szCs w:val="24"/>
+                <w:lang w:eastAsia="cs-CZ"/>
+              </w:rPr>
+              <w:t xml:space="preserve"> </w:t>
+            </w:r>
+            <w:proofErr w:type="spellStart"/>
+            <w:r>
+              <w:rPr>
+                <w:rFonts w:ascii="Arial" w:eastAsia="Times New Roman" w:hAnsi="Arial" w:cs="Arial"/>
+                <w:sz w:val="20"/>
+                <w:szCs w:val="24"/>
+                <w:lang w:eastAsia="cs-CZ"/>
+              </w:rPr>
+              <w:t>repozitář</w:t>
+            </w:r>
+            <w:proofErr w:type="spellEnd"/>
+            <w:r>
+              <w:rPr>
+                <w:rFonts w:ascii="Arial" w:eastAsia="Times New Roman" w:hAnsi="Arial" w:cs="Arial"/>
+                <w:sz w:val="20"/>
+                <w:szCs w:val="24"/>
+                <w:lang w:eastAsia="cs-CZ"/>
+              </w:rPr>
+              <w:t xml:space="preserve"> s výsledným kódem</w:t>
             </w:r>
             <w:r>
               <w:rPr>
@@ -1882,8 +2111,19 @@
                 <w:lang w:eastAsia="cs-CZ"/>
               </w:rPr>
               <w:br/>
-              <w:t>Prosím uveďte link na repozitář</w:t>
-            </w:r>
+              <w:t xml:space="preserve">Prosím uveďte link na </w:t>
+            </w:r>
+            <w:proofErr w:type="spellStart"/>
+            <w:r>
+              <w:rPr>
+                <w:rFonts w:ascii="Arial" w:eastAsia="Times New Roman" w:hAnsi="Arial" w:cs="Arial"/>
+                <w:sz w:val="20"/>
+                <w:szCs w:val="24"/>
+                <w:lang w:eastAsia="cs-CZ"/>
+              </w:rPr>
+              <w:t>repozitář</w:t>
+            </w:r>
+            <w:proofErr w:type="spellEnd"/>
           </w:p>
         </w:tc>
         <w:tc>
@@ -1903,6 +2143,7 @@
                 <w:lang w:eastAsia="cs-CZ"/>
               </w:rPr>
             </w:pPr>
+            <w:proofErr w:type="gramStart"/>
             <w:r>
               <w:rPr>
                 <w:rFonts w:ascii="Arial" w:eastAsia="Times New Roman" w:hAnsi="Arial" w:cs="Arial"/>
@@ -1912,6 +2153,7 @@
               </w:rPr>
               <w:t>100%</w:t>
             </w:r>
+            <w:proofErr w:type="gramEnd"/>
           </w:p>
         </w:tc>
         <w:tc>
@@ -1948,6 +2190,15 @@
                 <w:lang w:eastAsia="cs-CZ"/>
               </w:rPr>
             </w:pPr>
+            <w:r>
+              <w:rPr>
+                <w:rFonts w:ascii="Times New Roman" w:eastAsia="Times New Roman" w:hAnsi="Times New Roman" w:cs="Times New Roman"/>
+                <w:sz w:val="20"/>
+                <w:szCs w:val="20"/>
+                <w:lang w:eastAsia="cs-CZ"/>
+              </w:rPr>
+              <w:t>https://github.com/Adam-Hl/pgrf1.task1</w:t>
+            </w:r>
           </w:p>
         </w:tc>
       </w:tr>
@@ -2488,11 +2739,88 @@
               <w:cnfStyle w:val="000000000000" w:firstRow="0" w:lastRow="0" w:firstColumn="0" w:lastColumn="0" w:oddVBand="0" w:evenVBand="0" w:oddHBand="0" w:evenHBand="0" w:firstRowFirstColumn="0" w:firstRowLastColumn="0" w:lastRowFirstColumn="0" w:lastRowLastColumn="0"/>
               <w:rPr>
                 <w:rFonts w:ascii="Times New Roman" w:eastAsia="Times New Roman" w:hAnsi="Times New Roman" w:cs="Times New Roman"/>
-                <w:sz w:val="20"/>
-                <w:szCs w:val="20"/>
-                <w:lang w:eastAsia="cs-CZ"/>
-              </w:rPr>
-            </w:pPr>
+                <w:lang w:eastAsia="cs-CZ"/>
+              </w:rPr>
+            </w:pPr>
+            <w:r>
+              <w:rPr>
+                <w:rFonts w:ascii="Times New Roman" w:eastAsia="Times New Roman" w:hAnsi="Times New Roman" w:cs="Times New Roman"/>
+                <w:sz w:val="20"/>
+                <w:szCs w:val="20"/>
+                <w:lang w:eastAsia="cs-CZ"/>
+              </w:rPr>
+              <w:t xml:space="preserve">Na tento projekt jsem využil pouze GitHub </w:t>
+            </w:r>
+            <w:proofErr w:type="spellStart"/>
+            <w:r>
+              <w:rPr>
+                <w:rFonts w:ascii="Times New Roman" w:eastAsia="Times New Roman" w:hAnsi="Times New Roman" w:cs="Times New Roman"/>
+                <w:sz w:val="20"/>
+                <w:szCs w:val="20"/>
+                <w:lang w:eastAsia="cs-CZ"/>
+              </w:rPr>
+              <w:t>Copilot</w:t>
+            </w:r>
+            <w:proofErr w:type="spellEnd"/>
+            <w:r>
+              <w:rPr>
+                <w:rFonts w:ascii="Times New Roman" w:eastAsia="Times New Roman" w:hAnsi="Times New Roman" w:cs="Times New Roman"/>
+                <w:sz w:val="20"/>
+                <w:szCs w:val="20"/>
+                <w:lang w:eastAsia="cs-CZ"/>
+              </w:rPr>
+              <w:t xml:space="preserve"> uvnitř IDE a jeho doplňování kódu a in-line dotazy na syntax. Výpomoc u metod </w:t>
+            </w:r>
+            <w:proofErr w:type="spellStart"/>
+            <w:proofErr w:type="gramStart"/>
+            <w:r>
+              <w:rPr>
+                <w:rFonts w:ascii="Times New Roman" w:eastAsia="Times New Roman" w:hAnsi="Times New Roman" w:cs="Times New Roman"/>
+                <w:lang w:eastAsia="cs-CZ"/>
+              </w:rPr>
+              <w:t>repaintPolygons</w:t>
+            </w:r>
+            <w:proofErr w:type="spellEnd"/>
+            <w:r>
+              <w:rPr>
+                <w:rFonts w:ascii="Times New Roman" w:eastAsia="Times New Roman" w:hAnsi="Times New Roman" w:cs="Times New Roman"/>
+                <w:lang w:eastAsia="cs-CZ"/>
+              </w:rPr>
+              <w:t>(</w:t>
+            </w:r>
+            <w:proofErr w:type="gramEnd"/>
+            <w:r>
+              <w:rPr>
+                <w:rFonts w:ascii="Times New Roman" w:eastAsia="Times New Roman" w:hAnsi="Times New Roman" w:cs="Times New Roman"/>
+                <w:lang w:eastAsia="cs-CZ"/>
+              </w:rPr>
+              <w:t xml:space="preserve">) a </w:t>
+            </w:r>
+            <w:proofErr w:type="spellStart"/>
+            <w:proofErr w:type="gramStart"/>
+            <w:r>
+              <w:rPr>
+                <w:rFonts w:ascii="Times New Roman" w:eastAsia="Times New Roman" w:hAnsi="Times New Roman" w:cs="Times New Roman"/>
+                <w:lang w:eastAsia="cs-CZ"/>
+              </w:rPr>
+              <w:t>rasterize</w:t>
+            </w:r>
+            <w:proofErr w:type="spellEnd"/>
+            <w:r>
+              <w:rPr>
+                <w:rFonts w:ascii="Times New Roman" w:eastAsia="Times New Roman" w:hAnsi="Times New Roman" w:cs="Times New Roman"/>
+                <w:lang w:eastAsia="cs-CZ"/>
+              </w:rPr>
+              <w:t>(</w:t>
+            </w:r>
+            <w:proofErr w:type="gramEnd"/>
+            <w:r>
+              <w:rPr>
+                <w:rFonts w:ascii="Times New Roman" w:eastAsia="Times New Roman" w:hAnsi="Times New Roman" w:cs="Times New Roman"/>
+                <w:lang w:eastAsia="cs-CZ"/>
+              </w:rPr>
+              <w:t>)</w:t>
+            </w:r>
           </w:p>
         </w:tc>
       </w:tr>
@@ -3117,7 +3445,6 @@
   <w:style w:type="character" w:default="1" w:styleId="Standardnpsmoodstavce">
     <w:name w:val="Default Paragraph Font"/>
     <w:uiPriority w:val="1"/>
-    <w:semiHidden/>
     <w:unhideWhenUsed/>
   </w:style>
   <w:style w:type="table" w:default="1" w:styleId="Normlntabulka">
@@ -3327,6 +3654,36 @@
     <w:link w:val="Zpat"/>
     <w:uiPriority w:val="99"/>
     <w:rsid w:val="002C0FFA"/>
+  </w:style>
+  <w:style w:type="paragraph" w:styleId="FormtovanvHTML">
+    <w:name w:val="HTML Preformatted"/>
+    <w:basedOn w:val="Normln"/>
+    <w:link w:val="FormtovanvHTMLChar"/>
+    <w:uiPriority w:val="99"/>
+    <w:semiHidden/>
+    <w:unhideWhenUsed/>
+    <w:rsid w:val="007432DA"/>
+    <w:pPr>
+      <w:spacing w:after="0" w:line="240" w:lineRule="auto"/>
+    </w:pPr>
+    <w:rPr>
+      <w:rFonts w:ascii="Consolas" w:hAnsi="Consolas"/>
+      <w:sz w:val="20"/>
+      <w:szCs w:val="20"/>
+    </w:rPr>
+  </w:style>
+  <w:style w:type="character" w:customStyle="1" w:styleId="FormtovanvHTMLChar">
+    <w:name w:val="Formátovaný v HTML Char"/>
+    <w:basedOn w:val="Standardnpsmoodstavce"/>
+    <w:link w:val="FormtovanvHTML"/>
+    <w:uiPriority w:val="99"/>
+    <w:semiHidden/>
+    <w:rsid w:val="007432DA"/>
+    <w:rPr>
+      <w:rFonts w:ascii="Consolas" w:hAnsi="Consolas"/>
+      <w:sz w:val="20"/>
+      <w:szCs w:val="20"/>
+    </w:rPr>
   </w:style>
 </w:styles>
 </file>

</xml_diff>

<commit_message>
aktualizace .doc fix přepínání posouvaného body, když cursor přejel přes jiný bod
</commit_message>
<xml_diff>
--- a/doc/PozadavkyPGRF1_Task1_2026.docx
+++ b/doc/PozadavkyPGRF1_Task1_2026.docx
@@ -1362,7 +1362,7 @@
                 <w:highlight w:val="yellow"/>
                 <w:lang w:eastAsia="cs-CZ"/>
               </w:rPr>
-              <w:t>Levé tlačítko myši začne kreslení a přidává další body</w:t>
+              <w:t xml:space="preserve">Levé tlačítko myši začne kreslení a přidává další body. </w:t>
             </w:r>
             <w:r>
               <w:rPr>
@@ -1372,7 +1372,7 @@
                 <w:highlight w:val="yellow"/>
                 <w:lang w:eastAsia="cs-CZ"/>
               </w:rPr>
-              <w:t xml:space="preserve">. </w:t>
+              <w:t>„</w:t>
             </w:r>
             <w:r>
               <w:rPr>
@@ -1382,7 +1382,7 @@
                 <w:highlight w:val="yellow"/>
                 <w:lang w:eastAsia="cs-CZ"/>
               </w:rPr>
-              <w:t>„</w:t>
+              <w:t>A</w:t>
             </w:r>
             <w:r>
               <w:rPr>
@@ -1392,27 +1392,7 @@
                 <w:highlight w:val="yellow"/>
                 <w:lang w:eastAsia="cs-CZ"/>
               </w:rPr>
-              <w:t>A</w:t>
-            </w:r>
-            <w:r>
-              <w:rPr>
-                <w:rFonts w:ascii="Times New Roman" w:eastAsia="Times New Roman" w:hAnsi="Times New Roman" w:cs="Times New Roman"/>
-                <w:sz w:val="20"/>
-                <w:szCs w:val="20"/>
-                <w:highlight w:val="yellow"/>
-                <w:lang w:eastAsia="cs-CZ"/>
-              </w:rPr>
-              <w:t>nimace“ kreslení čáry při pohybu myš</w:t>
-            </w:r>
-            <w:r>
-              <w:rPr>
-                <w:rFonts w:ascii="Times New Roman" w:eastAsia="Times New Roman" w:hAnsi="Times New Roman" w:cs="Times New Roman"/>
-                <w:sz w:val="20"/>
-                <w:szCs w:val="20"/>
-                <w:highlight w:val="yellow"/>
-                <w:lang w:eastAsia="cs-CZ"/>
-              </w:rPr>
-              <w:t>í</w:t>
+              <w:t>nimace“ kreslení čáry při pohybu myší</w:t>
             </w:r>
           </w:p>
         </w:tc>
@@ -1697,7 +1677,6 @@
         </w:trPr>
         <w:tc>
           <w:tcPr>
-            <w:cnfStyle w:val="001000000000" w:firstRow="0" w:lastRow="0" w:firstColumn="1" w:lastColumn="0" w:oddVBand="0" w:evenVBand="0" w:oddHBand="0" w:evenHBand="0" w:firstRowFirstColumn="0" w:firstRowLastColumn="0" w:lastRowFirstColumn="0" w:lastRowLastColumn="0"/>
             <w:tcW w:w="1980" w:type="dxa"/>
             <w:vMerge w:val="restart"/>
             <w:noWrap/>
@@ -1705,6 +1684,7 @@
           </w:tcPr>
           <w:p>
             <w:pPr>
+              <w:cnfStyle w:val="001000000000" w:firstRow="0" w:lastRow="0" w:firstColumn="1" w:lastColumn="0" w:oddVBand="0" w:evenVBand="0" w:oddHBand="0" w:evenHBand="0" w:firstRowFirstColumn="0" w:firstRowLastColumn="0" w:lastRowFirstColumn="0" w:lastRowLastColumn="0"/>
               <w:rPr>
                 <w:rFonts w:ascii="Arial" w:eastAsia="Times New Roman" w:hAnsi="Arial" w:cs="Arial"/>
                 <w:sz w:val="20"/>
@@ -1730,7 +1710,6 @@
           </w:tcPr>
           <w:p>
             <w:pPr>
-              <w:cnfStyle w:val="000000000000" w:firstRow="0" w:lastRow="0" w:firstColumn="0" w:lastColumn="0" w:oddVBand="0" w:evenVBand="0" w:oddHBand="0" w:evenHBand="0" w:firstRowFirstColumn="0" w:firstRowLastColumn="0" w:lastRowFirstColumn="0" w:lastRowLastColumn="0"/>
               <w:rPr>
                 <w:rFonts w:ascii="Arial" w:eastAsia="Times New Roman" w:hAnsi="Arial" w:cs="Arial"/>
                 <w:sz w:val="20"/>
@@ -1759,14 +1738,24 @@
           <w:p>
             <w:pPr>
               <w:jc w:val="center"/>
-              <w:cnfStyle w:val="000000000000" w:firstRow="0" w:lastRow="0" w:firstColumn="0" w:lastColumn="0" w:oddVBand="0" w:evenVBand="0" w:oddHBand="0" w:evenHBand="0" w:firstRowFirstColumn="0" w:firstRowLastColumn="0" w:lastRowFirstColumn="0" w:lastRowLastColumn="0"/>
-              <w:rPr>
-                <w:rFonts w:ascii="Arial" w:eastAsia="Times New Roman" w:hAnsi="Arial" w:cs="Arial"/>
-                <w:sz w:val="20"/>
-                <w:szCs w:val="24"/>
-                <w:lang w:eastAsia="cs-CZ"/>
-              </w:rPr>
-            </w:pPr>
+              <w:rPr>
+                <w:rFonts w:ascii="Arial" w:eastAsia="Times New Roman" w:hAnsi="Arial" w:cs="Arial"/>
+                <w:sz w:val="20"/>
+                <w:szCs w:val="24"/>
+                <w:lang w:eastAsia="cs-CZ"/>
+              </w:rPr>
+            </w:pPr>
+            <w:proofErr w:type="gramStart"/>
+            <w:r>
+              <w:rPr>
+                <w:rFonts w:ascii="Arial" w:eastAsia="Times New Roman" w:hAnsi="Arial" w:cs="Arial"/>
+                <w:sz w:val="20"/>
+                <w:szCs w:val="24"/>
+                <w:lang w:eastAsia="cs-CZ"/>
+              </w:rPr>
+              <w:t>100%</w:t>
+            </w:r>
+            <w:proofErr w:type="gramEnd"/>
           </w:p>
         </w:tc>
         <w:tc>
@@ -1779,14 +1768,22 @@
           <w:p>
             <w:pPr>
               <w:jc w:val="center"/>
-              <w:cnfStyle w:val="000000000000" w:firstRow="0" w:lastRow="0" w:firstColumn="0" w:lastColumn="0" w:oddVBand="0" w:evenVBand="0" w:oddHBand="0" w:evenHBand="0" w:firstRowFirstColumn="0" w:firstRowLastColumn="0" w:lastRowFirstColumn="0" w:lastRowLastColumn="0"/>
-              <w:rPr>
-                <w:rFonts w:ascii="Times New Roman" w:eastAsia="Times New Roman" w:hAnsi="Times New Roman" w:cs="Times New Roman"/>
-                <w:sz w:val="20"/>
-                <w:szCs w:val="20"/>
-                <w:lang w:eastAsia="cs-CZ"/>
-              </w:rPr>
-            </w:pPr>
+              <w:rPr>
+                <w:rFonts w:ascii="Times New Roman" w:eastAsia="Times New Roman" w:hAnsi="Times New Roman" w:cs="Times New Roman"/>
+                <w:sz w:val="20"/>
+                <w:szCs w:val="20"/>
+                <w:lang w:eastAsia="cs-CZ"/>
+              </w:rPr>
+            </w:pPr>
+            <w:r>
+              <w:rPr>
+                <w:rFonts w:ascii="Times New Roman" w:eastAsia="Times New Roman" w:hAnsi="Times New Roman" w:cs="Times New Roman"/>
+                <w:sz w:val="20"/>
+                <w:szCs w:val="20"/>
+                <w:lang w:eastAsia="cs-CZ"/>
+              </w:rPr>
+              <w:t>Držením kolečka myši a tažením na novou pozici</w:t>
+            </w:r>
           </w:p>
         </w:tc>
         <w:tc>
@@ -1797,7 +1794,6 @@
           </w:tcPr>
           <w:p>
             <w:pPr>
-              <w:cnfStyle w:val="000000000000" w:firstRow="0" w:lastRow="0" w:firstColumn="0" w:lastColumn="0" w:oddVBand="0" w:evenVBand="0" w:oddHBand="0" w:evenHBand="0" w:firstRowFirstColumn="0" w:firstRowLastColumn="0" w:lastRowFirstColumn="0" w:lastRowLastColumn="0"/>
               <w:rPr>
                 <w:rFonts w:ascii="Times New Roman" w:eastAsia="Times New Roman" w:hAnsi="Times New Roman" w:cs="Times New Roman"/>
                 <w:sz w:val="20"/>
@@ -1876,6 +1872,17 @@
                 <w:lang w:eastAsia="cs-CZ"/>
               </w:rPr>
             </w:pPr>
+            <w:proofErr w:type="gramStart"/>
+            <w:r>
+              <w:rPr>
+                <w:rFonts w:ascii="Arial" w:eastAsia="Times New Roman" w:hAnsi="Arial" w:cs="Arial"/>
+                <w:sz w:val="20"/>
+                <w:szCs w:val="24"/>
+                <w:lang w:eastAsia="cs-CZ"/>
+              </w:rPr>
+              <w:t>100%</w:t>
+            </w:r>
+            <w:proofErr w:type="gramEnd"/>
           </w:p>
         </w:tc>
         <w:tc>
@@ -1896,6 +1903,33 @@
                 <w:lang w:eastAsia="cs-CZ"/>
               </w:rPr>
             </w:pPr>
+            <w:r>
+              <w:rPr>
+                <w:rFonts w:ascii="Times New Roman" w:eastAsia="Times New Roman" w:hAnsi="Times New Roman" w:cs="Times New Roman"/>
+                <w:sz w:val="20"/>
+                <w:szCs w:val="20"/>
+                <w:lang w:eastAsia="cs-CZ"/>
+              </w:rPr>
+              <w:t xml:space="preserve">Dvojklik </w:t>
+            </w:r>
+            <w:r>
+              <w:rPr>
+                <w:rFonts w:ascii="Times New Roman" w:eastAsia="Times New Roman" w:hAnsi="Times New Roman" w:cs="Times New Roman"/>
+                <w:sz w:val="20"/>
+                <w:szCs w:val="20"/>
+                <w:lang w:eastAsia="cs-CZ"/>
+              </w:rPr>
+              <w:t>pravým tlačítkem</w:t>
+            </w:r>
+            <w:r>
+              <w:rPr>
+                <w:rFonts w:ascii="Times New Roman" w:eastAsia="Times New Roman" w:hAnsi="Times New Roman" w:cs="Times New Roman"/>
+                <w:sz w:val="20"/>
+                <w:szCs w:val="20"/>
+                <w:lang w:eastAsia="cs-CZ"/>
+              </w:rPr>
+              <w:t xml:space="preserve"> myši</w:t>
+            </w:r>
           </w:p>
         </w:tc>
         <w:tc>
@@ -1914,6 +1948,15 @@
                 <w:lang w:eastAsia="cs-CZ"/>
               </w:rPr>
             </w:pPr>
+            <w:r>
+              <w:rPr>
+                <w:rFonts w:ascii="Times New Roman" w:eastAsia="Times New Roman" w:hAnsi="Times New Roman" w:cs="Times New Roman"/>
+                <w:sz w:val="20"/>
+                <w:szCs w:val="20"/>
+                <w:lang w:eastAsia="cs-CZ"/>
+              </w:rPr>
+              <w:t>Pokud má polygon méně než jeden bod, smaže se</w:t>
+            </w:r>
           </w:p>
         </w:tc>
       </w:tr>
@@ -1923,7 +1966,6 @@
         </w:trPr>
         <w:tc>
           <w:tcPr>
-            <w:cnfStyle w:val="001000000000" w:firstRow="0" w:lastRow="0" w:firstColumn="1" w:lastColumn="0" w:oddVBand="0" w:evenVBand="0" w:oddHBand="0" w:evenHBand="0" w:firstRowFirstColumn="0" w:firstRowLastColumn="0" w:lastRowFirstColumn="0" w:lastRowLastColumn="0"/>
             <w:tcW w:w="1980" w:type="dxa"/>
             <w:vMerge/>
             <w:noWrap/>
@@ -1931,6 +1973,7 @@
           </w:tcPr>
           <w:p>
             <w:pPr>
+              <w:cnfStyle w:val="001000000000" w:firstRow="0" w:lastRow="0" w:firstColumn="1" w:lastColumn="0" w:oddVBand="0" w:evenVBand="0" w:oddHBand="0" w:evenHBand="0" w:firstRowFirstColumn="0" w:firstRowLastColumn="0" w:lastRowFirstColumn="0" w:lastRowLastColumn="0"/>
               <w:rPr>
                 <w:rFonts w:ascii="Times New Roman" w:eastAsia="Times New Roman" w:hAnsi="Times New Roman" w:cs="Times New Roman"/>
                 <w:sz w:val="20"/>
@@ -1947,7 +1990,6 @@
           </w:tcPr>
           <w:p>
             <w:pPr>
-              <w:cnfStyle w:val="000000000000" w:firstRow="0" w:lastRow="0" w:firstColumn="0" w:lastColumn="0" w:oddVBand="0" w:evenVBand="0" w:oddHBand="0" w:evenHBand="0" w:firstRowFirstColumn="0" w:firstRowLastColumn="0" w:lastRowFirstColumn="0" w:lastRowLastColumn="0"/>
               <w:rPr>
                 <w:rFonts w:ascii="Arial" w:eastAsia="Times New Roman" w:hAnsi="Arial" w:cs="Arial"/>
                 <w:sz w:val="20"/>
@@ -1976,14 +2018,24 @@
           <w:p>
             <w:pPr>
               <w:jc w:val="center"/>
-              <w:cnfStyle w:val="000000000000" w:firstRow="0" w:lastRow="0" w:firstColumn="0" w:lastColumn="0" w:oddVBand="0" w:evenVBand="0" w:oddHBand="0" w:evenHBand="0" w:firstRowFirstColumn="0" w:firstRowLastColumn="0" w:lastRowFirstColumn="0" w:lastRowLastColumn="0"/>
-              <w:rPr>
-                <w:rFonts w:ascii="Arial" w:eastAsia="Times New Roman" w:hAnsi="Arial" w:cs="Arial"/>
-                <w:sz w:val="20"/>
-                <w:szCs w:val="24"/>
-                <w:lang w:eastAsia="cs-CZ"/>
-              </w:rPr>
-            </w:pPr>
+              <w:rPr>
+                <w:rFonts w:ascii="Arial" w:eastAsia="Times New Roman" w:hAnsi="Arial" w:cs="Arial"/>
+                <w:sz w:val="20"/>
+                <w:szCs w:val="24"/>
+                <w:lang w:eastAsia="cs-CZ"/>
+              </w:rPr>
+            </w:pPr>
+            <w:proofErr w:type="gramStart"/>
+            <w:r>
+              <w:rPr>
+                <w:rFonts w:ascii="Arial" w:eastAsia="Times New Roman" w:hAnsi="Arial" w:cs="Arial"/>
+                <w:sz w:val="20"/>
+                <w:szCs w:val="24"/>
+                <w:lang w:eastAsia="cs-CZ"/>
+              </w:rPr>
+              <w:t>90%</w:t>
+            </w:r>
+            <w:proofErr w:type="gramEnd"/>
           </w:p>
         </w:tc>
         <w:tc>
@@ -1996,14 +2048,22 @@
           <w:p>
             <w:pPr>
               <w:jc w:val="center"/>
-              <w:cnfStyle w:val="000000000000" w:firstRow="0" w:lastRow="0" w:firstColumn="0" w:lastColumn="0" w:oddVBand="0" w:evenVBand="0" w:oddHBand="0" w:evenHBand="0" w:firstRowFirstColumn="0" w:firstRowLastColumn="0" w:lastRowFirstColumn="0" w:lastRowLastColumn="0"/>
-              <w:rPr>
-                <w:rFonts w:ascii="Times New Roman" w:eastAsia="Times New Roman" w:hAnsi="Times New Roman" w:cs="Times New Roman"/>
-                <w:sz w:val="20"/>
-                <w:szCs w:val="20"/>
-                <w:lang w:eastAsia="cs-CZ"/>
-              </w:rPr>
-            </w:pPr>
+              <w:rPr>
+                <w:rFonts w:ascii="Times New Roman" w:eastAsia="Times New Roman" w:hAnsi="Times New Roman" w:cs="Times New Roman"/>
+                <w:sz w:val="20"/>
+                <w:szCs w:val="20"/>
+                <w:lang w:eastAsia="cs-CZ"/>
+              </w:rPr>
+            </w:pPr>
+            <w:r>
+              <w:rPr>
+                <w:rFonts w:ascii="Times New Roman" w:eastAsia="Times New Roman" w:hAnsi="Times New Roman" w:cs="Times New Roman"/>
+                <w:sz w:val="20"/>
+                <w:szCs w:val="20"/>
+                <w:lang w:eastAsia="cs-CZ"/>
+              </w:rPr>
+              <w:t>Dvojklik kolečkem myši</w:t>
+            </w:r>
           </w:p>
         </w:tc>
         <w:tc>
@@ -2014,14 +2074,62 @@
           </w:tcPr>
           <w:p>
             <w:pPr>
-              <w:cnfStyle w:val="000000000000" w:firstRow="0" w:lastRow="0" w:firstColumn="0" w:lastColumn="0" w:oddVBand="0" w:evenVBand="0" w:oddHBand="0" w:evenHBand="0" w:firstRowFirstColumn="0" w:firstRowLastColumn="0" w:lastRowFirstColumn="0" w:lastRowLastColumn="0"/>
-              <w:rPr>
-                <w:rFonts w:ascii="Times New Roman" w:eastAsia="Times New Roman" w:hAnsi="Times New Roman" w:cs="Times New Roman"/>
-                <w:sz w:val="20"/>
-                <w:szCs w:val="20"/>
-                <w:lang w:eastAsia="cs-CZ"/>
-              </w:rPr>
-            </w:pPr>
+              <w:rPr>
+                <w:rFonts w:ascii="Times New Roman" w:eastAsia="Times New Roman" w:hAnsi="Times New Roman" w:cs="Times New Roman"/>
+                <w:sz w:val="20"/>
+                <w:szCs w:val="20"/>
+                <w:lang w:eastAsia="cs-CZ"/>
+              </w:rPr>
+            </w:pPr>
+            <w:r>
+              <w:rPr>
+                <w:rFonts w:ascii="Times New Roman" w:eastAsia="Times New Roman" w:hAnsi="Times New Roman" w:cs="Times New Roman"/>
+                <w:sz w:val="20"/>
+                <w:szCs w:val="20"/>
+                <w:lang w:eastAsia="cs-CZ"/>
+              </w:rPr>
+              <w:t xml:space="preserve">Funguje na </w:t>
+            </w:r>
+            <w:proofErr w:type="gramStart"/>
+            <w:r>
+              <w:rPr>
+                <w:rFonts w:ascii="Times New Roman" w:eastAsia="Times New Roman" w:hAnsi="Times New Roman" w:cs="Times New Roman"/>
+                <w:sz w:val="20"/>
+                <w:szCs w:val="20"/>
+                <w:lang w:eastAsia="cs-CZ"/>
+              </w:rPr>
+              <w:t>90%</w:t>
+            </w:r>
+            <w:proofErr w:type="gramEnd"/>
+            <w:r>
+              <w:rPr>
+                <w:rFonts w:ascii="Times New Roman" w:eastAsia="Times New Roman" w:hAnsi="Times New Roman" w:cs="Times New Roman"/>
+                <w:sz w:val="20"/>
+                <w:szCs w:val="20"/>
+                <w:lang w:eastAsia="cs-CZ"/>
+              </w:rPr>
+              <w:t xml:space="preserve"> protože hledám nejbližší body, nikoliv úsečku. Někdy jsou dva body blíže, než </w:t>
+            </w:r>
+            <w:proofErr w:type="gramStart"/>
+            <w:r>
+              <w:rPr>
+                <w:rFonts w:ascii="Times New Roman" w:eastAsia="Times New Roman" w:hAnsi="Times New Roman" w:cs="Times New Roman"/>
+                <w:sz w:val="20"/>
+                <w:szCs w:val="20"/>
+                <w:lang w:eastAsia="cs-CZ"/>
+              </w:rPr>
+              <w:t>úsečka</w:t>
+            </w:r>
+            <w:proofErr w:type="gramEnd"/>
+            <w:r>
+              <w:rPr>
+                <w:rFonts w:ascii="Times New Roman" w:eastAsia="Times New Roman" w:hAnsi="Times New Roman" w:cs="Times New Roman"/>
+                <w:sz w:val="20"/>
+                <w:szCs w:val="20"/>
+                <w:lang w:eastAsia="cs-CZ"/>
+              </w:rPr>
+              <w:t xml:space="preserve"> na kterou chci přidat bod</w:t>
+            </w:r>
           </w:p>
         </w:tc>
       </w:tr>
@@ -2794,7 +2902,21 @@
                 <w:rFonts w:ascii="Times New Roman" w:eastAsia="Times New Roman" w:hAnsi="Times New Roman" w:cs="Times New Roman"/>
                 <w:lang w:eastAsia="cs-CZ"/>
               </w:rPr>
-              <w:t xml:space="preserve">) a </w:t>
+              <w:t>)</w:t>
+            </w:r>
+            <w:r>
+              <w:rPr>
+                <w:rFonts w:ascii="Times New Roman" w:eastAsia="Times New Roman" w:hAnsi="Times New Roman" w:cs="Times New Roman"/>
+                <w:lang w:eastAsia="cs-CZ"/>
+              </w:rPr>
+              <w:t xml:space="preserve"> a</w:t>
+            </w:r>
+            <w:r>
+              <w:rPr>
+                <w:rFonts w:ascii="Times New Roman" w:eastAsia="Times New Roman" w:hAnsi="Times New Roman" w:cs="Times New Roman"/>
+                <w:lang w:eastAsia="cs-CZ"/>
+              </w:rPr>
+              <w:t xml:space="preserve"> </w:t>
             </w:r>
             <w:proofErr w:type="spellStart"/>
             <w:proofErr w:type="gramStart"/>
@@ -3445,6 +3567,7 @@
   <w:style w:type="character" w:default="1" w:styleId="Standardnpsmoodstavce">
     <w:name w:val="Default Paragraph Font"/>
     <w:uiPriority w:val="1"/>
+    <w:semiHidden/>
     <w:unhideWhenUsed/>
   </w:style>
   <w:style w:type="table" w:default="1" w:styleId="Normlntabulka">

</xml_diff>

<commit_message>
update README.md a .doc
</commit_message>
<xml_diff>
--- a/doc/PozadavkyPGRF1_Task1_2026.docx
+++ b/doc/PozadavkyPGRF1_Task1_2026.docx
@@ -391,7 +391,17 @@
                 <w:highlight w:val="yellow"/>
                 <w:lang w:eastAsia="cs-CZ"/>
               </w:rPr>
-              <w:t>Levé tlačítko myši začne kreslení a přidává další body</w:t>
+              <w:t>Levé tlačítko myši začne kreslení</w:t>
+            </w:r>
+            <w:r>
+              <w:rPr>
+                <w:rFonts w:ascii="Times New Roman" w:eastAsia="Times New Roman" w:hAnsi="Times New Roman" w:cs="Times New Roman"/>
+                <w:sz w:val="20"/>
+                <w:szCs w:val="20"/>
+                <w:highlight w:val="yellow"/>
+                <w:lang w:eastAsia="cs-CZ"/>
+              </w:rPr>
+              <w:t>.</w:t>
             </w:r>
           </w:p>
         </w:tc>
@@ -726,7 +736,7 @@
                 <w:highlight w:val="yellow"/>
                 <w:lang w:eastAsia="cs-CZ"/>
               </w:rPr>
-              <w:t>Pravým tlačítkem myši se ukončí kreslení</w:t>
+              <w:t>Druhé kliknutí levým tlačítkem myši kreslení ukončí</w:t>
             </w:r>
           </w:p>
         </w:tc>
@@ -1042,52 +1052,7 @@
                 <w:szCs w:val="20"/>
                 <w:lang w:eastAsia="cs-CZ"/>
               </w:rPr>
-              <w:t>Využití abstraktní třídy i rozhraní</w:t>
-            </w:r>
-            <w:r>
-              <w:rPr>
-                <w:rFonts w:ascii="Times New Roman" w:eastAsia="Times New Roman" w:hAnsi="Times New Roman" w:cs="Times New Roman"/>
-                <w:sz w:val="20"/>
-                <w:szCs w:val="20"/>
-                <w:lang w:eastAsia="cs-CZ"/>
-              </w:rPr>
-              <w:t xml:space="preserve"> pro vykreslení</w:t>
-            </w:r>
-            <w:r>
-              <w:rPr>
-                <w:rFonts w:ascii="Times New Roman" w:eastAsia="Times New Roman" w:hAnsi="Times New Roman" w:cs="Times New Roman"/>
-                <w:sz w:val="20"/>
-                <w:szCs w:val="20"/>
-                <w:lang w:eastAsia="cs-CZ"/>
-              </w:rPr>
-              <w:t xml:space="preserve">. Úsečka </w:t>
-            </w:r>
-            <w:r>
-              <w:rPr>
-                <w:rFonts w:ascii="Times New Roman" w:eastAsia="Times New Roman" w:hAnsi="Times New Roman" w:cs="Times New Roman"/>
-                <w:sz w:val="20"/>
-                <w:szCs w:val="20"/>
-                <w:lang w:eastAsia="cs-CZ"/>
-              </w:rPr>
-              <w:t xml:space="preserve">samotná </w:t>
-            </w:r>
-            <w:r>
-              <w:rPr>
-                <w:rFonts w:ascii="Times New Roman" w:eastAsia="Times New Roman" w:hAnsi="Times New Roman" w:cs="Times New Roman"/>
-                <w:sz w:val="20"/>
-                <w:szCs w:val="20"/>
-                <w:lang w:eastAsia="cs-CZ"/>
-              </w:rPr>
-              <w:t>nemá vlastní datovou strukturu, z důvodu snadnější implementace využívá třídu Polygon</w:t>
-            </w:r>
-            <w:r>
-              <w:rPr>
-                <w:rFonts w:ascii="Times New Roman" w:eastAsia="Times New Roman" w:hAnsi="Times New Roman" w:cs="Times New Roman"/>
-                <w:sz w:val="20"/>
-                <w:szCs w:val="20"/>
-                <w:lang w:eastAsia="cs-CZ"/>
-              </w:rPr>
-              <w:t xml:space="preserve"> (polygon s dvěma body)</w:t>
+              <w:t>Střída Segment z ničeho nedědí</w:t>
             </w:r>
           </w:p>
         </w:tc>
@@ -1655,7 +1620,25 @@
                 <w:szCs w:val="20"/>
                 <w:lang w:eastAsia="cs-CZ"/>
               </w:rPr>
-              <w:t xml:space="preserve">Vymazání seznamu polygonů a vymazání </w:t>
+              <w:t xml:space="preserve">Vymazání seznamu </w:t>
+            </w:r>
+            <w:r>
+              <w:rPr>
+                <w:rFonts w:ascii="Times New Roman" w:eastAsia="Times New Roman" w:hAnsi="Times New Roman" w:cs="Times New Roman"/>
+                <w:sz w:val="20"/>
+                <w:szCs w:val="20"/>
+                <w:lang w:eastAsia="cs-CZ"/>
+              </w:rPr>
+              <w:t>tvarů</w:t>
+            </w:r>
+            <w:r>
+              <w:rPr>
+                <w:rFonts w:ascii="Times New Roman" w:eastAsia="Times New Roman" w:hAnsi="Times New Roman" w:cs="Times New Roman"/>
+                <w:sz w:val="20"/>
+                <w:szCs w:val="20"/>
+                <w:lang w:eastAsia="cs-CZ"/>
+              </w:rPr>
+              <w:t xml:space="preserve"> a vymazání </w:t>
             </w:r>
             <w:proofErr w:type="spellStart"/>
             <w:r>
@@ -1677,6 +1660,7 @@
         </w:trPr>
         <w:tc>
           <w:tcPr>
+            <w:cnfStyle w:val="001000000000" w:firstRow="0" w:lastRow="0" w:firstColumn="1" w:lastColumn="0" w:oddVBand="0" w:evenVBand="0" w:oddHBand="0" w:evenHBand="0" w:firstRowFirstColumn="0" w:firstRowLastColumn="0" w:lastRowFirstColumn="0" w:lastRowLastColumn="0"/>
             <w:tcW w:w="1980" w:type="dxa"/>
             <w:vMerge w:val="restart"/>
             <w:noWrap/>
@@ -1684,7 +1668,6 @@
           </w:tcPr>
           <w:p>
             <w:pPr>
-              <w:cnfStyle w:val="001000000000" w:firstRow="0" w:lastRow="0" w:firstColumn="1" w:lastColumn="0" w:oddVBand="0" w:evenVBand="0" w:oddHBand="0" w:evenHBand="0" w:firstRowFirstColumn="0" w:firstRowLastColumn="0" w:lastRowFirstColumn="0" w:lastRowLastColumn="0"/>
               <w:rPr>
                 <w:rFonts w:ascii="Arial" w:eastAsia="Times New Roman" w:hAnsi="Arial" w:cs="Arial"/>
                 <w:sz w:val="20"/>
@@ -1710,6 +1693,7 @@
           </w:tcPr>
           <w:p>
             <w:pPr>
+              <w:cnfStyle w:val="000000000000" w:firstRow="0" w:lastRow="0" w:firstColumn="0" w:lastColumn="0" w:oddVBand="0" w:evenVBand="0" w:oddHBand="0" w:evenHBand="0" w:firstRowFirstColumn="0" w:firstRowLastColumn="0" w:lastRowFirstColumn="0" w:lastRowLastColumn="0"/>
               <w:rPr>
                 <w:rFonts w:ascii="Arial" w:eastAsia="Times New Roman" w:hAnsi="Arial" w:cs="Arial"/>
                 <w:sz w:val="20"/>
@@ -1738,6 +1722,7 @@
           <w:p>
             <w:pPr>
               <w:jc w:val="center"/>
+              <w:cnfStyle w:val="000000000000" w:firstRow="0" w:lastRow="0" w:firstColumn="0" w:lastColumn="0" w:oddVBand="0" w:evenVBand="0" w:oddHBand="0" w:evenHBand="0" w:firstRowFirstColumn="0" w:firstRowLastColumn="0" w:lastRowFirstColumn="0" w:lastRowLastColumn="0"/>
               <w:rPr>
                 <w:rFonts w:ascii="Arial" w:eastAsia="Times New Roman" w:hAnsi="Arial" w:cs="Arial"/>
                 <w:sz w:val="20"/>
@@ -1768,6 +1753,7 @@
           <w:p>
             <w:pPr>
               <w:jc w:val="center"/>
+              <w:cnfStyle w:val="000000000000" w:firstRow="0" w:lastRow="0" w:firstColumn="0" w:lastColumn="0" w:oddVBand="0" w:evenVBand="0" w:oddHBand="0" w:evenHBand="0" w:firstRowFirstColumn="0" w:firstRowLastColumn="0" w:lastRowFirstColumn="0" w:lastRowLastColumn="0"/>
               <w:rPr>
                 <w:rFonts w:ascii="Times New Roman" w:eastAsia="Times New Roman" w:hAnsi="Times New Roman" w:cs="Times New Roman"/>
                 <w:sz w:val="20"/>
@@ -1794,6 +1780,7 @@
           </w:tcPr>
           <w:p>
             <w:pPr>
+              <w:cnfStyle w:val="000000000000" w:firstRow="0" w:lastRow="0" w:firstColumn="0" w:lastColumn="0" w:oddVBand="0" w:evenVBand="0" w:oddHBand="0" w:evenHBand="0" w:firstRowFirstColumn="0" w:firstRowLastColumn="0" w:lastRowFirstColumn="0" w:lastRowLastColumn="0"/>
               <w:rPr>
                 <w:rFonts w:ascii="Times New Roman" w:eastAsia="Times New Roman" w:hAnsi="Times New Roman" w:cs="Times New Roman"/>
                 <w:sz w:val="20"/>
@@ -1966,6 +1953,7 @@
         </w:trPr>
         <w:tc>
           <w:tcPr>
+            <w:cnfStyle w:val="001000000000" w:firstRow="0" w:lastRow="0" w:firstColumn="1" w:lastColumn="0" w:oddVBand="0" w:evenVBand="0" w:oddHBand="0" w:evenHBand="0" w:firstRowFirstColumn="0" w:firstRowLastColumn="0" w:lastRowFirstColumn="0" w:lastRowLastColumn="0"/>
             <w:tcW w:w="1980" w:type="dxa"/>
             <w:vMerge/>
             <w:noWrap/>
@@ -1973,7 +1961,6 @@
           </w:tcPr>
           <w:p>
             <w:pPr>
-              <w:cnfStyle w:val="001000000000" w:firstRow="0" w:lastRow="0" w:firstColumn="1" w:lastColumn="0" w:oddVBand="0" w:evenVBand="0" w:oddHBand="0" w:evenHBand="0" w:firstRowFirstColumn="0" w:firstRowLastColumn="0" w:lastRowFirstColumn="0" w:lastRowLastColumn="0"/>
               <w:rPr>
                 <w:rFonts w:ascii="Times New Roman" w:eastAsia="Times New Roman" w:hAnsi="Times New Roman" w:cs="Times New Roman"/>
                 <w:sz w:val="20"/>
@@ -1990,6 +1977,7 @@
           </w:tcPr>
           <w:p>
             <w:pPr>
+              <w:cnfStyle w:val="000000000000" w:firstRow="0" w:lastRow="0" w:firstColumn="0" w:lastColumn="0" w:oddVBand="0" w:evenVBand="0" w:oddHBand="0" w:evenHBand="0" w:firstRowFirstColumn="0" w:firstRowLastColumn="0" w:lastRowFirstColumn="0" w:lastRowLastColumn="0"/>
               <w:rPr>
                 <w:rFonts w:ascii="Arial" w:eastAsia="Times New Roman" w:hAnsi="Arial" w:cs="Arial"/>
                 <w:sz w:val="20"/>
@@ -2018,6 +2006,7 @@
           <w:p>
             <w:pPr>
               <w:jc w:val="center"/>
+              <w:cnfStyle w:val="000000000000" w:firstRow="0" w:lastRow="0" w:firstColumn="0" w:lastColumn="0" w:oddVBand="0" w:evenVBand="0" w:oddHBand="0" w:evenHBand="0" w:firstRowFirstColumn="0" w:firstRowLastColumn="0" w:lastRowFirstColumn="0" w:lastRowLastColumn="0"/>
               <w:rPr>
                 <w:rFonts w:ascii="Arial" w:eastAsia="Times New Roman" w:hAnsi="Arial" w:cs="Arial"/>
                 <w:sz w:val="20"/>
@@ -2048,6 +2037,7 @@
           <w:p>
             <w:pPr>
               <w:jc w:val="center"/>
+              <w:cnfStyle w:val="000000000000" w:firstRow="0" w:lastRow="0" w:firstColumn="0" w:lastColumn="0" w:oddVBand="0" w:evenVBand="0" w:oddHBand="0" w:evenHBand="0" w:firstRowFirstColumn="0" w:firstRowLastColumn="0" w:lastRowFirstColumn="0" w:lastRowLastColumn="0"/>
               <w:rPr>
                 <w:rFonts w:ascii="Times New Roman" w:eastAsia="Times New Roman" w:hAnsi="Times New Roman" w:cs="Times New Roman"/>
                 <w:sz w:val="20"/>
@@ -2074,6 +2064,7 @@
           </w:tcPr>
           <w:p>
             <w:pPr>
+              <w:cnfStyle w:val="000000000000" w:firstRow="0" w:lastRow="0" w:firstColumn="0" w:lastColumn="0" w:oddVBand="0" w:evenVBand="0" w:oddHBand="0" w:evenHBand="0" w:firstRowFirstColumn="0" w:firstRowLastColumn="0" w:lastRowFirstColumn="0" w:lastRowLastColumn="0"/>
               <w:rPr>
                 <w:rFonts w:ascii="Times New Roman" w:eastAsia="Times New Roman" w:hAnsi="Times New Roman" w:cs="Times New Roman"/>
                 <w:sz w:val="20"/>
@@ -2358,6 +2349,15 @@
                 <w:lang w:eastAsia="cs-CZ"/>
               </w:rPr>
             </w:pPr>
+            <w:r>
+              <w:rPr>
+                <w:rFonts w:ascii="Arial" w:eastAsia="Times New Roman" w:hAnsi="Arial" w:cs="Arial"/>
+                <w:sz w:val="20"/>
+                <w:szCs w:val="24"/>
+                <w:lang w:eastAsia="cs-CZ"/>
+              </w:rPr>
+              <w:t>Přepínání mezi módy Segment a Polygon</w:t>
+            </w:r>
           </w:p>
         </w:tc>
         <w:tc>
@@ -2424,6 +2424,15 @@
                 <w:lang w:eastAsia="cs-CZ"/>
               </w:rPr>
               <w:t xml:space="preserve"> </w:t>
+            </w:r>
+            <w:r>
+              <w:rPr>
+                <w:rFonts w:ascii="Times New Roman" w:eastAsia="Times New Roman" w:hAnsi="Times New Roman" w:cs="Times New Roman"/>
+                <w:sz w:val="20"/>
+                <w:szCs w:val="20"/>
+                <w:lang w:eastAsia="cs-CZ"/>
+              </w:rPr>
+              <w:t>Default je mód Segment. Mód se vztahuje na kreslení i úpravu tvarů</w:t>
             </w:r>
           </w:p>
         </w:tc>
@@ -2886,7 +2895,14 @@
                 <w:rFonts w:ascii="Times New Roman" w:eastAsia="Times New Roman" w:hAnsi="Times New Roman" w:cs="Times New Roman"/>
                 <w:lang w:eastAsia="cs-CZ"/>
               </w:rPr>
-              <w:t>repaintPolygons</w:t>
+              <w:t>repaint</w:t>
+            </w:r>
+            <w:r>
+              <w:rPr>
+                <w:rFonts w:ascii="Times New Roman" w:eastAsia="Times New Roman" w:hAnsi="Times New Roman" w:cs="Times New Roman"/>
+                <w:lang w:eastAsia="cs-CZ"/>
+              </w:rPr>
+              <w:t>Shapes</w:t>
             </w:r>
             <w:proofErr w:type="spellEnd"/>
             <w:r>

</xml_diff>

<commit_message>
upravený komentář a .doc
</commit_message>
<xml_diff>
--- a/doc/PozadavkyPGRF1_Task1_2026.docx
+++ b/doc/PozadavkyPGRF1_Task1_2026.docx
@@ -1,6 +1,6 @@
 
 <file path=word/document.xml><?xml version="1.0" encoding="utf-8"?>
-<w:document xmlns:wpc="http://schemas.microsoft.com/office/word/2010/wordprocessingCanvas" xmlns:cx="http://schemas.microsoft.com/office/drawing/2014/chartex" xmlns:cx1="http://schemas.microsoft.com/office/drawing/2015/9/8/chartex" xmlns:cx2="http://schemas.microsoft.com/office/drawing/2015/10/21/chartex" xmlns:cx3="http://schemas.microsoft.com/office/drawing/2016/5/9/chartex" xmlns:cx4="http://schemas.microsoft.com/office/drawing/2016/5/10/chartex" xmlns:cx5="http://schemas.microsoft.com/office/drawing/2016/5/11/chartex" xmlns:cx6="http://schemas.microsoft.com/office/drawing/2016/5/12/chartex" xmlns:cx7="http://schemas.microsoft.com/office/drawing/2016/5/13/chartex" xmlns:cx8="http://schemas.microsoft.com/office/drawing/2016/5/14/chartex" xmlns:mc="http://schemas.openxmlformats.org/markup-compatibility/2006" xmlns:aink="http://schemas.microsoft.com/office/drawing/2016/ink" xmlns:am3d="http://schemas.microsoft.com/office/drawing/2017/model3d" xmlns:o="urn:schemas-microsoft-com:office:office" xmlns:oel="http://schemas.microsoft.com/office/2019/extlst" xmlns:r="http://schemas.openxmlformats.org/officeDocument/2006/relationships" xmlns:m="http://schemas.openxmlformats.org/officeDocument/2006/math" xmlns:v="urn:schemas-microsoft-com:vml" xmlns:wp14="http://schemas.microsoft.com/office/word/2010/wordprocessingDrawing" xmlns:wp="http://schemas.openxmlformats.org/drawingml/2006/wordprocessingDrawing" xmlns:w10="urn:schemas-microsoft-com:office:word" xmlns:w="http://schemas.openxmlformats.org/wordprocessingml/2006/main" xmlns:w14="http://schemas.microsoft.com/office/word/2010/wordml" xmlns:w15="http://schemas.microsoft.com/office/word/2012/wordml" xmlns:w16cex="http://schemas.microsoft.com/office/word/2018/wordml/cex" xmlns:w16cid="http://schemas.microsoft.com/office/word/2016/wordml/cid" xmlns:w16="http://schemas.microsoft.com/office/word/2018/wordml" xmlns:w16sdtdh="http://schemas.microsoft.com/office/word/2020/wordml/sdtdatahash" xmlns:w16se="http://schemas.microsoft.com/office/word/2015/wordml/symex" xmlns:wpg="http://schemas.microsoft.com/office/word/2010/wordprocessingGroup" xmlns:wpi="http://schemas.microsoft.com/office/word/2010/wordprocessingInk" xmlns:wne="http://schemas.microsoft.com/office/word/2006/wordml" xmlns:wps="http://schemas.microsoft.com/office/word/2010/wordprocessingShape" mc:Ignorable="w14 w15 w16se w16cid w16 w16cex w16sdtdh wp14">
+<w:document xmlns:wpc="http://schemas.microsoft.com/office/word/2010/wordprocessingCanvas" xmlns:cx="http://schemas.microsoft.com/office/drawing/2014/chartex" xmlns:cx1="http://schemas.microsoft.com/office/drawing/2015/9/8/chartex" xmlns:cx2="http://schemas.microsoft.com/office/drawing/2015/10/21/chartex" xmlns:cx3="http://schemas.microsoft.com/office/drawing/2016/5/9/chartex" xmlns:cx4="http://schemas.microsoft.com/office/drawing/2016/5/10/chartex" xmlns:cx5="http://schemas.microsoft.com/office/drawing/2016/5/11/chartex" xmlns:cx6="http://schemas.microsoft.com/office/drawing/2016/5/12/chartex" xmlns:cx7="http://schemas.microsoft.com/office/drawing/2016/5/13/chartex" xmlns:cx8="http://schemas.microsoft.com/office/drawing/2016/5/14/chartex" xmlns:mc="http://schemas.openxmlformats.org/markup-compatibility/2006" xmlns:aink="http://schemas.microsoft.com/office/drawing/2016/ink" xmlns:am3d="http://schemas.microsoft.com/office/drawing/2017/model3d" xmlns:o="urn:schemas-microsoft-com:office:office" xmlns:oel="http://schemas.microsoft.com/office/2019/extlst" xmlns:r="http://schemas.openxmlformats.org/officeDocument/2006/relationships" xmlns:m="http://schemas.openxmlformats.org/officeDocument/2006/math" xmlns:v="urn:schemas-microsoft-com:vml" xmlns:wp14="http://schemas.microsoft.com/office/word/2010/wordprocessingDrawing" xmlns:wp="http://schemas.openxmlformats.org/drawingml/2006/wordprocessingDrawing" xmlns:w10="urn:schemas-microsoft-com:office:word" xmlns:w="http://schemas.openxmlformats.org/wordprocessingml/2006/main" xmlns:w14="http://schemas.microsoft.com/office/word/2010/wordml" xmlns:w15="http://schemas.microsoft.com/office/word/2012/wordml" xmlns:w16cex="http://schemas.microsoft.com/office/word/2018/wordml/cex" xmlns:w16cid="http://schemas.microsoft.com/office/word/2016/wordml/cid" xmlns:w16="http://schemas.microsoft.com/office/word/2018/wordml" xmlns:w16du="http://schemas.microsoft.com/office/word/2023/wordml/word16du" xmlns:w16sdtdh="http://schemas.microsoft.com/office/word/2020/wordml/sdtdatahash" xmlns:w16sdtfl="http://schemas.microsoft.com/office/word/2024/wordml/sdtformatlock" xmlns:w16se="http://schemas.microsoft.com/office/word/2015/wordml/symex" xmlns:wpg="http://schemas.microsoft.com/office/word/2010/wordprocessingGroup" xmlns:wpi="http://schemas.microsoft.com/office/word/2010/wordprocessingInk" xmlns:wne="http://schemas.microsoft.com/office/word/2006/wordml" xmlns:wps="http://schemas.microsoft.com/office/word/2010/wordprocessingShape" mc:Ignorable="w14 w15 w16se w16cid w16 w16cex w16sdtdh w16sdtfl w16du wp14">
   <w:body>
     <w:tbl>
       <w:tblPr>
@@ -298,27 +298,7 @@
                 <w:szCs w:val="24"/>
                 <w:lang w:eastAsia="cs-CZ"/>
               </w:rPr>
-              <w:t xml:space="preserve">Správná </w:t>
-            </w:r>
-            <w:proofErr w:type="spellStart"/>
-            <w:r>
-              <w:rPr>
-                <w:rFonts w:ascii="Arial" w:eastAsia="Times New Roman" w:hAnsi="Arial" w:cs="Arial"/>
-                <w:sz w:val="20"/>
-                <w:szCs w:val="24"/>
-                <w:lang w:eastAsia="cs-CZ"/>
-              </w:rPr>
-              <w:t>rasterizace</w:t>
-            </w:r>
-            <w:proofErr w:type="spellEnd"/>
-            <w:r>
-              <w:rPr>
-                <w:rFonts w:ascii="Arial" w:eastAsia="Times New Roman" w:hAnsi="Arial" w:cs="Arial"/>
-                <w:sz w:val="20"/>
-                <w:szCs w:val="24"/>
-                <w:lang w:eastAsia="cs-CZ"/>
-              </w:rPr>
-              <w:t xml:space="preserve"> ve všech kvadrantech</w:t>
+              <w:t>Správná rasterizace ve všech kvadrantech</w:t>
             </w:r>
             <w:r>
               <w:rPr>
@@ -350,7 +330,6 @@
                 <w:lang w:eastAsia="cs-CZ"/>
               </w:rPr>
             </w:pPr>
-            <w:proofErr w:type="gramStart"/>
             <w:r>
               <w:rPr>
                 <w:rFonts w:ascii="Arial" w:eastAsia="Times New Roman" w:hAnsi="Arial" w:cs="Arial"/>
@@ -361,7 +340,6 @@
               </w:rPr>
               <w:t>100%</w:t>
             </w:r>
-            <w:proofErr w:type="gramEnd"/>
           </w:p>
         </w:tc>
         <w:tc>
@@ -481,19 +459,8 @@
                 <w:szCs w:val="24"/>
                 <w:lang w:eastAsia="cs-CZ"/>
               </w:rPr>
-              <w:t xml:space="preserve">Označení algoritmu </w:t>
-            </w:r>
-            <w:proofErr w:type="spellStart"/>
-            <w:r>
-              <w:rPr>
-                <w:rFonts w:ascii="Arial" w:eastAsia="Times New Roman" w:hAnsi="Arial" w:cs="Arial"/>
-                <w:sz w:val="20"/>
-                <w:szCs w:val="24"/>
-                <w:lang w:eastAsia="cs-CZ"/>
-              </w:rPr>
-              <w:t>rasterizace</w:t>
-            </w:r>
-            <w:proofErr w:type="spellEnd"/>
+              <w:t>Označení algoritmu rasterizace</w:t>
+            </w:r>
             <w:r>
               <w:rPr>
                 <w:rFonts w:ascii="Arial" w:eastAsia="Times New Roman" w:hAnsi="Arial" w:cs="Arial"/>
@@ -551,7 +518,6 @@
                 <w:lang w:eastAsia="cs-CZ"/>
               </w:rPr>
             </w:pPr>
-            <w:proofErr w:type="gramStart"/>
             <w:r>
               <w:rPr>
                 <w:rFonts w:ascii="Arial" w:eastAsia="Times New Roman" w:hAnsi="Arial" w:cs="Arial"/>
@@ -562,7 +528,6 @@
               </w:rPr>
               <w:t>100%</w:t>
             </w:r>
-            <w:proofErr w:type="gramEnd"/>
           </w:p>
         </w:tc>
         <w:tc>
@@ -695,7 +660,6 @@
                 <w:lang w:eastAsia="cs-CZ"/>
               </w:rPr>
             </w:pPr>
-            <w:proofErr w:type="gramStart"/>
             <w:r>
               <w:rPr>
                 <w:rFonts w:ascii="Arial" w:eastAsia="Times New Roman" w:hAnsi="Arial" w:cs="Arial"/>
@@ -706,7 +670,6 @@
               </w:rPr>
               <w:t>100%</w:t>
             </w:r>
-            <w:proofErr w:type="gramEnd"/>
           </w:p>
         </w:tc>
         <w:tc>
@@ -763,27 +726,7 @@
                 <w:szCs w:val="20"/>
                 <w:lang w:eastAsia="cs-CZ"/>
               </w:rPr>
-              <w:t xml:space="preserve">Ošetřeno přidávání bodů do jednoho </w:t>
-            </w:r>
-            <w:proofErr w:type="gramStart"/>
-            <w:r>
-              <w:rPr>
-                <w:rFonts w:ascii="Times New Roman" w:eastAsia="Times New Roman" w:hAnsi="Times New Roman" w:cs="Times New Roman"/>
-                <w:sz w:val="20"/>
-                <w:szCs w:val="20"/>
-                <w:lang w:eastAsia="cs-CZ"/>
-              </w:rPr>
-              <w:t>objektu</w:t>
-            </w:r>
-            <w:proofErr w:type="gramEnd"/>
-            <w:r>
-              <w:rPr>
-                <w:rFonts w:ascii="Times New Roman" w:eastAsia="Times New Roman" w:hAnsi="Times New Roman" w:cs="Times New Roman"/>
-                <w:sz w:val="20"/>
-                <w:szCs w:val="20"/>
-                <w:lang w:eastAsia="cs-CZ"/>
-              </w:rPr>
-              <w:t xml:space="preserve"> dokud není ukončen</w:t>
+              <w:t>Ošetřeno přidávání bodů do jednoho objektu dokud není ukončen</w:t>
             </w:r>
           </w:p>
         </w:tc>
@@ -865,7 +808,6 @@
                 <w:lang w:eastAsia="cs-CZ"/>
               </w:rPr>
             </w:pPr>
-            <w:proofErr w:type="gramStart"/>
             <w:r>
               <w:rPr>
                 <w:rFonts w:ascii="Arial" w:eastAsia="Times New Roman" w:hAnsi="Arial" w:cs="Arial"/>
@@ -876,7 +818,6 @@
               </w:rPr>
               <w:t>100%</w:t>
             </w:r>
-            <w:proofErr w:type="gramEnd"/>
           </w:p>
         </w:tc>
         <w:tc>
@@ -996,7 +937,6 @@
                 <w:lang w:eastAsia="cs-CZ"/>
               </w:rPr>
             </w:pPr>
-            <w:proofErr w:type="gramStart"/>
             <w:r>
               <w:rPr>
                 <w:rFonts w:ascii="Arial" w:eastAsia="Times New Roman" w:hAnsi="Arial" w:cs="Arial"/>
@@ -1007,7 +947,6 @@
               </w:rPr>
               <w:t>90%</w:t>
             </w:r>
-            <w:proofErr w:type="gramEnd"/>
           </w:p>
         </w:tc>
         <w:tc>
@@ -1138,7 +1077,6 @@
                 <w:lang w:eastAsia="cs-CZ"/>
               </w:rPr>
             </w:pPr>
-            <w:proofErr w:type="gramStart"/>
             <w:r>
               <w:rPr>
                 <w:rFonts w:ascii="Arial" w:eastAsia="Times New Roman" w:hAnsi="Arial" w:cs="Arial"/>
@@ -1149,7 +1087,6 @@
               </w:rPr>
               <w:t>100%</w:t>
             </w:r>
-            <w:proofErr w:type="gramEnd"/>
           </w:p>
         </w:tc>
         <w:tc>
@@ -1205,27 +1142,7 @@
                 <w:szCs w:val="20"/>
                 <w:lang w:eastAsia="cs-CZ"/>
               </w:rPr>
-              <w:t>(</w:t>
-            </w:r>
-            <w:proofErr w:type="spellStart"/>
-            <w:r>
-              <w:rPr>
-                <w:rFonts w:ascii="Times New Roman" w:eastAsia="Times New Roman" w:hAnsi="Times New Roman" w:cs="Times New Roman"/>
-                <w:sz w:val="20"/>
-                <w:szCs w:val="20"/>
-                <w:lang w:eastAsia="cs-CZ"/>
-              </w:rPr>
-              <w:t>isClosed</w:t>
-            </w:r>
-            <w:proofErr w:type="spellEnd"/>
-            <w:r>
-              <w:rPr>
-                <w:rFonts w:ascii="Times New Roman" w:eastAsia="Times New Roman" w:hAnsi="Times New Roman" w:cs="Times New Roman"/>
-                <w:sz w:val="20"/>
-                <w:szCs w:val="20"/>
-                <w:lang w:eastAsia="cs-CZ"/>
-              </w:rPr>
-              <w:t>)</w:t>
+              <w:t>(isClosed)</w:t>
             </w:r>
           </w:p>
         </w:tc>
@@ -1299,7 +1216,6 @@
                 <w:lang w:eastAsia="cs-CZ"/>
               </w:rPr>
             </w:pPr>
-            <w:proofErr w:type="gramStart"/>
             <w:r>
               <w:rPr>
                 <w:rFonts w:ascii="Arial" w:eastAsia="Times New Roman" w:hAnsi="Arial" w:cs="Arial"/>
@@ -1310,7 +1226,6 @@
               </w:rPr>
               <w:t>100%</w:t>
             </w:r>
-            <w:proofErr w:type="gramEnd"/>
           </w:p>
         </w:tc>
         <w:tc>
@@ -1459,7 +1374,6 @@
                 <w:lang w:eastAsia="cs-CZ"/>
               </w:rPr>
             </w:pPr>
-            <w:proofErr w:type="gramStart"/>
             <w:r>
               <w:rPr>
                 <w:rFonts w:ascii="Arial" w:eastAsia="Times New Roman" w:hAnsi="Arial" w:cs="Arial"/>
@@ -1470,7 +1384,6 @@
               </w:rPr>
               <w:t>100%</w:t>
             </w:r>
-            <w:proofErr w:type="gramEnd"/>
           </w:p>
         </w:tc>
         <w:tc>
@@ -1576,7 +1489,6 @@
                 <w:lang w:eastAsia="cs-CZ"/>
               </w:rPr>
             </w:pPr>
-            <w:proofErr w:type="gramStart"/>
             <w:r>
               <w:rPr>
                 <w:rFonts w:ascii="Times New Roman" w:eastAsia="Times New Roman" w:hAnsi="Times New Roman" w:cs="Times New Roman"/>
@@ -1587,7 +1499,6 @@
               </w:rPr>
               <w:t>100%</w:t>
             </w:r>
-            <w:proofErr w:type="gramEnd"/>
           </w:p>
         </w:tc>
         <w:tc>
@@ -1662,19 +1573,8 @@
                 <w:szCs w:val="20"/>
                 <w:lang w:eastAsia="cs-CZ"/>
               </w:rPr>
-              <w:t xml:space="preserve"> a vymazání </w:t>
-            </w:r>
-            <w:proofErr w:type="spellStart"/>
-            <w:r>
-              <w:rPr>
-                <w:rFonts w:ascii="Times New Roman" w:eastAsia="Times New Roman" w:hAnsi="Times New Roman" w:cs="Times New Roman"/>
-                <w:sz w:val="20"/>
-                <w:szCs w:val="20"/>
-                <w:lang w:eastAsia="cs-CZ"/>
-              </w:rPr>
-              <w:t>rasteru</w:t>
-            </w:r>
-            <w:proofErr w:type="spellEnd"/>
+              <w:t xml:space="preserve"> a vymazání rasteru</w:t>
+            </w:r>
           </w:p>
         </w:tc>
       </w:tr>
@@ -1754,7 +1654,6 @@
                 <w:lang w:eastAsia="cs-CZ"/>
               </w:rPr>
             </w:pPr>
-            <w:proofErr w:type="gramStart"/>
             <w:r>
               <w:rPr>
                 <w:rFonts w:ascii="Arial" w:eastAsia="Times New Roman" w:hAnsi="Arial" w:cs="Arial"/>
@@ -1764,7 +1663,6 @@
               </w:rPr>
               <w:t>100%</w:t>
             </w:r>
-            <w:proofErr w:type="gramEnd"/>
           </w:p>
         </w:tc>
         <w:tc>
@@ -1883,7 +1781,6 @@
                 <w:lang w:eastAsia="cs-CZ"/>
               </w:rPr>
             </w:pPr>
-            <w:proofErr w:type="gramStart"/>
             <w:r>
               <w:rPr>
                 <w:rFonts w:ascii="Arial" w:eastAsia="Times New Roman" w:hAnsi="Arial" w:cs="Arial"/>
@@ -1893,7 +1790,6 @@
               </w:rPr>
               <w:t>100%</w:t>
             </w:r>
-            <w:proofErr w:type="gramEnd"/>
           </w:p>
         </w:tc>
         <w:tc>
@@ -2038,7 +1934,6 @@
                 <w:lang w:eastAsia="cs-CZ"/>
               </w:rPr>
             </w:pPr>
-            <w:proofErr w:type="gramStart"/>
             <w:r>
               <w:rPr>
                 <w:rFonts w:ascii="Arial" w:eastAsia="Times New Roman" w:hAnsi="Arial" w:cs="Arial"/>
@@ -2048,7 +1943,6 @@
               </w:rPr>
               <w:t>90%</w:t>
             </w:r>
-            <w:proofErr w:type="gramEnd"/>
           </w:p>
         </w:tc>
         <w:tc>
@@ -2103,47 +1997,7 @@
                 <w:szCs w:val="20"/>
                 <w:lang w:eastAsia="cs-CZ"/>
               </w:rPr>
-              <w:t xml:space="preserve">Funguje na </w:t>
-            </w:r>
-            <w:proofErr w:type="gramStart"/>
-            <w:r>
-              <w:rPr>
-                <w:rFonts w:ascii="Times New Roman" w:eastAsia="Times New Roman" w:hAnsi="Times New Roman" w:cs="Times New Roman"/>
-                <w:sz w:val="20"/>
-                <w:szCs w:val="20"/>
-                <w:lang w:eastAsia="cs-CZ"/>
-              </w:rPr>
-              <w:t>90%</w:t>
-            </w:r>
-            <w:proofErr w:type="gramEnd"/>
-            <w:r>
-              <w:rPr>
-                <w:rFonts w:ascii="Times New Roman" w:eastAsia="Times New Roman" w:hAnsi="Times New Roman" w:cs="Times New Roman"/>
-                <w:sz w:val="20"/>
-                <w:szCs w:val="20"/>
-                <w:lang w:eastAsia="cs-CZ"/>
-              </w:rPr>
-              <w:t xml:space="preserve"> protože hledám nejbližší body, nikoliv úsečku. Někdy jsou dva body blíže, než </w:t>
-            </w:r>
-            <w:proofErr w:type="gramStart"/>
-            <w:r>
-              <w:rPr>
-                <w:rFonts w:ascii="Times New Roman" w:eastAsia="Times New Roman" w:hAnsi="Times New Roman" w:cs="Times New Roman"/>
-                <w:sz w:val="20"/>
-                <w:szCs w:val="20"/>
-                <w:lang w:eastAsia="cs-CZ"/>
-              </w:rPr>
-              <w:t>úsečka</w:t>
-            </w:r>
-            <w:proofErr w:type="gramEnd"/>
-            <w:r>
-              <w:rPr>
-                <w:rFonts w:ascii="Times New Roman" w:eastAsia="Times New Roman" w:hAnsi="Times New Roman" w:cs="Times New Roman"/>
-                <w:sz w:val="20"/>
-                <w:szCs w:val="20"/>
-                <w:lang w:eastAsia="cs-CZ"/>
-              </w:rPr>
-              <w:t xml:space="preserve"> na kterou chci přidat bod</w:t>
+              <w:t>Funguje na 90% protože hledám nejbližší body, nikoliv úsečku. Někdy jsou dva body blíže, než úsečka na kterou chci přidat bod</w:t>
             </w:r>
           </w:p>
         </w:tc>
@@ -2186,45 +2040,14 @@
                 <w:lang w:eastAsia="cs-CZ"/>
               </w:rPr>
             </w:pPr>
-            <w:proofErr w:type="spellStart"/>
-            <w:r>
-              <w:rPr>
-                <w:rFonts w:ascii="Arial" w:eastAsia="Times New Roman" w:hAnsi="Arial" w:cs="Arial"/>
-                <w:sz w:val="20"/>
-                <w:szCs w:val="24"/>
-                <w:lang w:eastAsia="cs-CZ"/>
-              </w:rPr>
-              <w:t>GITový</w:t>
-            </w:r>
-            <w:proofErr w:type="spellEnd"/>
-            <w:r>
-              <w:rPr>
-                <w:rFonts w:ascii="Arial" w:eastAsia="Times New Roman" w:hAnsi="Arial" w:cs="Arial"/>
-                <w:sz w:val="20"/>
-                <w:szCs w:val="24"/>
-                <w:lang w:eastAsia="cs-CZ"/>
-              </w:rPr>
-              <w:t xml:space="preserve"> </w:t>
-            </w:r>
-            <w:proofErr w:type="spellStart"/>
-            <w:r>
-              <w:rPr>
-                <w:rFonts w:ascii="Arial" w:eastAsia="Times New Roman" w:hAnsi="Arial" w:cs="Arial"/>
-                <w:sz w:val="20"/>
-                <w:szCs w:val="24"/>
-                <w:lang w:eastAsia="cs-CZ"/>
-              </w:rPr>
-              <w:t>repozitář</w:t>
-            </w:r>
-            <w:proofErr w:type="spellEnd"/>
-            <w:r>
-              <w:rPr>
-                <w:rFonts w:ascii="Arial" w:eastAsia="Times New Roman" w:hAnsi="Arial" w:cs="Arial"/>
-                <w:sz w:val="20"/>
-                <w:szCs w:val="24"/>
-                <w:lang w:eastAsia="cs-CZ"/>
-              </w:rPr>
-              <w:t xml:space="preserve"> s výsledným kódem</w:t>
+            <w:r>
+              <w:rPr>
+                <w:rFonts w:ascii="Arial" w:eastAsia="Times New Roman" w:hAnsi="Arial" w:cs="Arial"/>
+                <w:sz w:val="20"/>
+                <w:szCs w:val="24"/>
+                <w:lang w:eastAsia="cs-CZ"/>
+              </w:rPr>
+              <w:t>GITový repozitář s výsledným kódem</w:t>
             </w:r>
             <w:r>
               <w:rPr>
@@ -2234,19 +2057,8 @@
                 <w:lang w:eastAsia="cs-CZ"/>
               </w:rPr>
               <w:br/>
-              <w:t xml:space="preserve">Prosím uveďte link na </w:t>
-            </w:r>
-            <w:proofErr w:type="spellStart"/>
-            <w:r>
-              <w:rPr>
-                <w:rFonts w:ascii="Arial" w:eastAsia="Times New Roman" w:hAnsi="Arial" w:cs="Arial"/>
-                <w:sz w:val="20"/>
-                <w:szCs w:val="24"/>
-                <w:lang w:eastAsia="cs-CZ"/>
-              </w:rPr>
-              <w:t>repozitář</w:t>
-            </w:r>
-            <w:proofErr w:type="spellEnd"/>
+              <w:t>Prosím uveďte link na repozitář</w:t>
+            </w:r>
           </w:p>
         </w:tc>
         <w:tc>
@@ -2266,7 +2078,6 @@
                 <w:lang w:eastAsia="cs-CZ"/>
               </w:rPr>
             </w:pPr>
-            <w:proofErr w:type="gramStart"/>
             <w:r>
               <w:rPr>
                 <w:rFonts w:ascii="Arial" w:eastAsia="Times New Roman" w:hAnsi="Arial" w:cs="Arial"/>
@@ -2276,7 +2087,6 @@
               </w:rPr>
               <w:t>100%</w:t>
             </w:r>
-            <w:proofErr w:type="gramEnd"/>
           </w:p>
         </w:tc>
         <w:tc>
@@ -2331,6 +2141,7 @@
         </w:trPr>
         <w:tc>
           <w:tcPr>
+            <w:cnfStyle w:val="001000000000" w:firstRow="0" w:lastRow="0" w:firstColumn="1" w:lastColumn="0" w:oddVBand="0" w:evenVBand="0" w:oddHBand="0" w:evenHBand="0" w:firstRowFirstColumn="0" w:firstRowLastColumn="0" w:lastRowFirstColumn="0" w:lastRowLastColumn="0"/>
             <w:tcW w:w="1980" w:type="dxa"/>
             <w:vMerge w:val="restart"/>
             <w:noWrap/>
@@ -2338,7 +2149,6 @@
           </w:tcPr>
           <w:p>
             <w:pPr>
-              <w:cnfStyle w:val="001000000000" w:firstRow="0" w:lastRow="0" w:firstColumn="1" w:lastColumn="0" w:oddVBand="0" w:evenVBand="0" w:oddHBand="0" w:evenHBand="0" w:firstRowFirstColumn="0" w:firstRowLastColumn="0" w:lastRowFirstColumn="0" w:lastRowLastColumn="0"/>
               <w:rPr>
                 <w:rFonts w:ascii="Arial" w:eastAsia="Times New Roman" w:hAnsi="Arial" w:cs="Arial"/>
                 <w:sz w:val="20"/>
@@ -2365,6 +2175,7 @@
           </w:tcPr>
           <w:p>
             <w:pPr>
+              <w:cnfStyle w:val="000000000000" w:firstRow="0" w:lastRow="0" w:firstColumn="0" w:lastColumn="0" w:oddVBand="0" w:evenVBand="0" w:oddHBand="0" w:evenHBand="0" w:firstRowFirstColumn="0" w:firstRowLastColumn="0" w:lastRowFirstColumn="0" w:lastRowLastColumn="0"/>
               <w:rPr>
                 <w:rFonts w:ascii="Arial" w:eastAsia="Times New Roman" w:hAnsi="Arial" w:cs="Arial"/>
                 <w:sz w:val="20"/>
@@ -2393,14 +2204,14 @@
           <w:p>
             <w:pPr>
               <w:jc w:val="center"/>
-              <w:rPr>
-                <w:rFonts w:ascii="Times New Roman" w:eastAsia="Times New Roman" w:hAnsi="Times New Roman" w:cs="Times New Roman"/>
-                <w:sz w:val="20"/>
-                <w:szCs w:val="20"/>
-                <w:lang w:eastAsia="cs-CZ"/>
-              </w:rPr>
-            </w:pPr>
-            <w:proofErr w:type="gramStart"/>
+              <w:cnfStyle w:val="000000000000" w:firstRow="0" w:lastRow="0" w:firstColumn="0" w:lastColumn="0" w:oddVBand="0" w:evenVBand="0" w:oddHBand="0" w:evenHBand="0" w:firstRowFirstColumn="0" w:firstRowLastColumn="0" w:lastRowFirstColumn="0" w:lastRowLastColumn="0"/>
+              <w:rPr>
+                <w:rFonts w:ascii="Times New Roman" w:eastAsia="Times New Roman" w:hAnsi="Times New Roman" w:cs="Times New Roman"/>
+                <w:sz w:val="20"/>
+                <w:szCs w:val="20"/>
+                <w:lang w:eastAsia="cs-CZ"/>
+              </w:rPr>
+            </w:pPr>
             <w:r>
               <w:rPr>
                 <w:rFonts w:ascii="Times New Roman" w:eastAsia="Times New Roman" w:hAnsi="Times New Roman" w:cs="Times New Roman"/>
@@ -2410,7 +2221,6 @@
               </w:rPr>
               <w:t>100%</w:t>
             </w:r>
-            <w:proofErr w:type="gramEnd"/>
           </w:p>
         </w:tc>
         <w:tc>
@@ -2423,13 +2233,23 @@
           <w:p>
             <w:pPr>
               <w:jc w:val="center"/>
-              <w:rPr>
-                <w:rFonts w:ascii="Times New Roman" w:eastAsia="Times New Roman" w:hAnsi="Times New Roman" w:cs="Times New Roman"/>
-                <w:sz w:val="20"/>
-                <w:szCs w:val="20"/>
-                <w:lang w:eastAsia="cs-CZ"/>
-              </w:rPr>
-            </w:pPr>
+              <w:cnfStyle w:val="000000000000" w:firstRow="0" w:lastRow="0" w:firstColumn="0" w:lastColumn="0" w:oddVBand="0" w:evenVBand="0" w:oddHBand="0" w:evenHBand="0" w:firstRowFirstColumn="0" w:firstRowLastColumn="0" w:lastRowFirstColumn="0" w:lastRowLastColumn="0"/>
+              <w:rPr>
+                <w:rFonts w:ascii="Times New Roman" w:eastAsia="Times New Roman" w:hAnsi="Times New Roman" w:cs="Times New Roman"/>
+                <w:sz w:val="20"/>
+                <w:szCs w:val="20"/>
+                <w:lang w:eastAsia="cs-CZ"/>
+              </w:rPr>
+            </w:pPr>
+            <w:r>
+              <w:rPr>
+                <w:rFonts w:ascii="Times New Roman" w:eastAsia="Times New Roman" w:hAnsi="Times New Roman" w:cs="Times New Roman"/>
+                <w:sz w:val="20"/>
+                <w:szCs w:val="20"/>
+                <w:lang w:eastAsia="cs-CZ"/>
+              </w:rPr>
+              <w:t>Stisknutí klávesy X. Výpis režimu do konsole</w:t>
+            </w:r>
           </w:p>
         </w:tc>
         <w:tc>
@@ -2440,6 +2260,7 @@
           </w:tcPr>
           <w:p>
             <w:pPr>
+              <w:cnfStyle w:val="000000000000" w:firstRow="0" w:lastRow="0" w:firstColumn="0" w:lastColumn="0" w:oddVBand="0" w:evenVBand="0" w:oddHBand="0" w:evenHBand="0" w:firstRowFirstColumn="0" w:firstRowLastColumn="0" w:lastRowFirstColumn="0" w:lastRowLastColumn="0"/>
               <w:rPr>
                 <w:rFonts w:ascii="Times New Roman" w:eastAsia="Times New Roman" w:hAnsi="Times New Roman" w:cs="Times New Roman"/>
                 <w:sz w:val="20"/>
@@ -2897,30 +2718,8 @@
                 <w:szCs w:val="20"/>
                 <w:lang w:eastAsia="cs-CZ"/>
               </w:rPr>
-              <w:t xml:space="preserve">Na tento projekt jsem využil pouze GitHub </w:t>
-            </w:r>
-            <w:proofErr w:type="spellStart"/>
-            <w:r>
-              <w:rPr>
-                <w:rFonts w:ascii="Times New Roman" w:eastAsia="Times New Roman" w:hAnsi="Times New Roman" w:cs="Times New Roman"/>
-                <w:sz w:val="20"/>
-                <w:szCs w:val="20"/>
-                <w:lang w:eastAsia="cs-CZ"/>
-              </w:rPr>
-              <w:t>Copilot</w:t>
-            </w:r>
-            <w:proofErr w:type="spellEnd"/>
-            <w:r>
-              <w:rPr>
-                <w:rFonts w:ascii="Times New Roman" w:eastAsia="Times New Roman" w:hAnsi="Times New Roman" w:cs="Times New Roman"/>
-                <w:sz w:val="20"/>
-                <w:szCs w:val="20"/>
-                <w:lang w:eastAsia="cs-CZ"/>
-              </w:rPr>
-              <w:t xml:space="preserve"> uvnitř IDE a jeho doplňování kódu a in-line dotazy na syntax. Výpomoc u metod </w:t>
-            </w:r>
-            <w:proofErr w:type="spellStart"/>
-            <w:proofErr w:type="gramStart"/>
+              <w:t xml:space="preserve">Na tento projekt jsem využil pouze GitHub Copilot uvnitř IDE a jeho doplňování kódu a in-line dotazy na syntax. Výpomoc u metod </w:t>
+            </w:r>
             <w:r>
               <w:rPr>
                 <w:rFonts w:ascii="Times New Roman" w:eastAsia="Times New Roman" w:hAnsi="Times New Roman" w:cs="Times New Roman"/>
@@ -2935,21 +2734,12 @@
               </w:rPr>
               <w:t>Shapes</w:t>
             </w:r>
-            <w:proofErr w:type="spellEnd"/>
-            <w:r>
-              <w:rPr>
-                <w:rFonts w:ascii="Times New Roman" w:eastAsia="Times New Roman" w:hAnsi="Times New Roman" w:cs="Times New Roman"/>
-                <w:lang w:eastAsia="cs-CZ"/>
-              </w:rPr>
-              <w:t>(</w:t>
-            </w:r>
-            <w:proofErr w:type="gramEnd"/>
-            <w:r>
-              <w:rPr>
-                <w:rFonts w:ascii="Times New Roman" w:eastAsia="Times New Roman" w:hAnsi="Times New Roman" w:cs="Times New Roman"/>
-                <w:lang w:eastAsia="cs-CZ"/>
-              </w:rPr>
-              <w:t>)</w:t>
+            <w:r>
+              <w:rPr>
+                <w:rFonts w:ascii="Times New Roman" w:eastAsia="Times New Roman" w:hAnsi="Times New Roman" w:cs="Times New Roman"/>
+                <w:lang w:eastAsia="cs-CZ"/>
+              </w:rPr>
+              <w:t>()</w:t>
             </w:r>
             <w:r>
               <w:rPr>
@@ -2965,7 +2755,6 @@
               </w:rPr>
               <w:t xml:space="preserve"> </w:t>
             </w:r>
-            <w:proofErr w:type="spellStart"/>
             <w:r>
               <w:rPr>
                 <w:rFonts w:ascii="Times New Roman" w:eastAsia="Times New Roman" w:hAnsi="Times New Roman" w:cs="Times New Roman"/>
@@ -2973,7 +2762,6 @@
               </w:rPr>
               <w:t>rasterize</w:t>
             </w:r>
-            <w:proofErr w:type="spellEnd"/>
             <w:r>
               <w:rPr>
                 <w:rFonts w:ascii="Times New Roman" w:eastAsia="Times New Roman" w:hAnsi="Times New Roman" w:cs="Times New Roman"/>
@@ -3004,7 +2792,7 @@
 </file>
 
 <file path=word/endnotes.xml><?xml version="1.0" encoding="utf-8"?>
-<w:endnotes xmlns:wpc="http://schemas.microsoft.com/office/word/2010/wordprocessingCanvas" xmlns:cx="http://schemas.microsoft.com/office/drawing/2014/chartex" xmlns:cx1="http://schemas.microsoft.com/office/drawing/2015/9/8/chartex" xmlns:cx2="http://schemas.microsoft.com/office/drawing/2015/10/21/chartex" xmlns:cx3="http://schemas.microsoft.com/office/drawing/2016/5/9/chartex" xmlns:cx4="http://schemas.microsoft.com/office/drawing/2016/5/10/chartex" xmlns:cx5="http://schemas.microsoft.com/office/drawing/2016/5/11/chartex" xmlns:cx6="http://schemas.microsoft.com/office/drawing/2016/5/12/chartex" xmlns:cx7="http://schemas.microsoft.com/office/drawing/2016/5/13/chartex" xmlns:cx8="http://schemas.microsoft.com/office/drawing/2016/5/14/chartex" xmlns:mc="http://schemas.openxmlformats.org/markup-compatibility/2006" xmlns:aink="http://schemas.microsoft.com/office/drawing/2016/ink" xmlns:am3d="http://schemas.microsoft.com/office/drawing/2017/model3d" xmlns:o="urn:schemas-microsoft-com:office:office" xmlns:oel="http://schemas.microsoft.com/office/2019/extlst" xmlns:r="http://schemas.openxmlformats.org/officeDocument/2006/relationships" xmlns:m="http://schemas.openxmlformats.org/officeDocument/2006/math" xmlns:v="urn:schemas-microsoft-com:vml" xmlns:wp14="http://schemas.microsoft.com/office/word/2010/wordprocessingDrawing" xmlns:wp="http://schemas.openxmlformats.org/drawingml/2006/wordprocessingDrawing" xmlns:w10="urn:schemas-microsoft-com:office:word" xmlns:w="http://schemas.openxmlformats.org/wordprocessingml/2006/main" xmlns:w14="http://schemas.microsoft.com/office/word/2010/wordml" xmlns:w15="http://schemas.microsoft.com/office/word/2012/wordml" xmlns:w16cex="http://schemas.microsoft.com/office/word/2018/wordml/cex" xmlns:w16cid="http://schemas.microsoft.com/office/word/2016/wordml/cid" xmlns:w16="http://schemas.microsoft.com/office/word/2018/wordml" xmlns:w16sdtdh="http://schemas.microsoft.com/office/word/2020/wordml/sdtdatahash" xmlns:w16se="http://schemas.microsoft.com/office/word/2015/wordml/symex" xmlns:wpg="http://schemas.microsoft.com/office/word/2010/wordprocessingGroup" xmlns:wpi="http://schemas.microsoft.com/office/word/2010/wordprocessingInk" xmlns:wne="http://schemas.microsoft.com/office/word/2006/wordml" xmlns:wps="http://schemas.microsoft.com/office/word/2010/wordprocessingShape" mc:Ignorable="w14 w15 w16se w16cid w16 w16cex w16sdtdh wp14">
+<w:endnotes xmlns:wpc="http://schemas.microsoft.com/office/word/2010/wordprocessingCanvas" xmlns:cx="http://schemas.microsoft.com/office/drawing/2014/chartex" xmlns:cx1="http://schemas.microsoft.com/office/drawing/2015/9/8/chartex" xmlns:cx2="http://schemas.microsoft.com/office/drawing/2015/10/21/chartex" xmlns:cx3="http://schemas.microsoft.com/office/drawing/2016/5/9/chartex" xmlns:cx4="http://schemas.microsoft.com/office/drawing/2016/5/10/chartex" xmlns:cx5="http://schemas.microsoft.com/office/drawing/2016/5/11/chartex" xmlns:cx6="http://schemas.microsoft.com/office/drawing/2016/5/12/chartex" xmlns:cx7="http://schemas.microsoft.com/office/drawing/2016/5/13/chartex" xmlns:cx8="http://schemas.microsoft.com/office/drawing/2016/5/14/chartex" xmlns:mc="http://schemas.openxmlformats.org/markup-compatibility/2006" xmlns:aink="http://schemas.microsoft.com/office/drawing/2016/ink" xmlns:am3d="http://schemas.microsoft.com/office/drawing/2017/model3d" xmlns:o="urn:schemas-microsoft-com:office:office" xmlns:oel="http://schemas.microsoft.com/office/2019/extlst" xmlns:r="http://schemas.openxmlformats.org/officeDocument/2006/relationships" xmlns:m="http://schemas.openxmlformats.org/officeDocument/2006/math" xmlns:v="urn:schemas-microsoft-com:vml" xmlns:wp14="http://schemas.microsoft.com/office/word/2010/wordprocessingDrawing" xmlns:wp="http://schemas.openxmlformats.org/drawingml/2006/wordprocessingDrawing" xmlns:w10="urn:schemas-microsoft-com:office:word" xmlns:w="http://schemas.openxmlformats.org/wordprocessingml/2006/main" xmlns:w14="http://schemas.microsoft.com/office/word/2010/wordml" xmlns:w15="http://schemas.microsoft.com/office/word/2012/wordml" xmlns:w16cex="http://schemas.microsoft.com/office/word/2018/wordml/cex" xmlns:w16cid="http://schemas.microsoft.com/office/word/2016/wordml/cid" xmlns:w16="http://schemas.microsoft.com/office/word/2018/wordml" xmlns:w16du="http://schemas.microsoft.com/office/word/2023/wordml/word16du" xmlns:w16sdtdh="http://schemas.microsoft.com/office/word/2020/wordml/sdtdatahash" xmlns:w16sdtfl="http://schemas.microsoft.com/office/word/2024/wordml/sdtformatlock" xmlns:w16se="http://schemas.microsoft.com/office/word/2015/wordml/symex" xmlns:wpg="http://schemas.microsoft.com/office/word/2010/wordprocessingGroup" xmlns:wpi="http://schemas.microsoft.com/office/word/2010/wordprocessingInk" xmlns:wne="http://schemas.microsoft.com/office/word/2006/wordml" xmlns:wps="http://schemas.microsoft.com/office/word/2010/wordprocessingShape" mc:Ignorable="w14 w15 w16se w16cid w16 w16cex w16sdtdh w16sdtfl w16du wp14">
   <w:endnote w:type="separator" w:id="-1">
     <w:p>
       <w:pPr>
@@ -3029,7 +2817,7 @@
 </file>
 
 <file path=word/footnotes.xml><?xml version="1.0" encoding="utf-8"?>
-<w:footnotes xmlns:wpc="http://schemas.microsoft.com/office/word/2010/wordprocessingCanvas" xmlns:cx="http://schemas.microsoft.com/office/drawing/2014/chartex" xmlns:cx1="http://schemas.microsoft.com/office/drawing/2015/9/8/chartex" xmlns:cx2="http://schemas.microsoft.com/office/drawing/2015/10/21/chartex" xmlns:cx3="http://schemas.microsoft.com/office/drawing/2016/5/9/chartex" xmlns:cx4="http://schemas.microsoft.com/office/drawing/2016/5/10/chartex" xmlns:cx5="http://schemas.microsoft.com/office/drawing/2016/5/11/chartex" xmlns:cx6="http://schemas.microsoft.com/office/drawing/2016/5/12/chartex" xmlns:cx7="http://schemas.microsoft.com/office/drawing/2016/5/13/chartex" xmlns:cx8="http://schemas.microsoft.com/office/drawing/2016/5/14/chartex" xmlns:mc="http://schemas.openxmlformats.org/markup-compatibility/2006" xmlns:aink="http://schemas.microsoft.com/office/drawing/2016/ink" xmlns:am3d="http://schemas.microsoft.com/office/drawing/2017/model3d" xmlns:o="urn:schemas-microsoft-com:office:office" xmlns:oel="http://schemas.microsoft.com/office/2019/extlst" xmlns:r="http://schemas.openxmlformats.org/officeDocument/2006/relationships" xmlns:m="http://schemas.openxmlformats.org/officeDocument/2006/math" xmlns:v="urn:schemas-microsoft-com:vml" xmlns:wp14="http://schemas.microsoft.com/office/word/2010/wordprocessingDrawing" xmlns:wp="http://schemas.openxmlformats.org/drawingml/2006/wordprocessingDrawing" xmlns:w10="urn:schemas-microsoft-com:office:word" xmlns:w="http://schemas.openxmlformats.org/wordprocessingml/2006/main" xmlns:w14="http://schemas.microsoft.com/office/word/2010/wordml" xmlns:w15="http://schemas.microsoft.com/office/word/2012/wordml" xmlns:w16cex="http://schemas.microsoft.com/office/word/2018/wordml/cex" xmlns:w16cid="http://schemas.microsoft.com/office/word/2016/wordml/cid" xmlns:w16="http://schemas.microsoft.com/office/word/2018/wordml" xmlns:w16sdtdh="http://schemas.microsoft.com/office/word/2020/wordml/sdtdatahash" xmlns:w16se="http://schemas.microsoft.com/office/word/2015/wordml/symex" xmlns:wpg="http://schemas.microsoft.com/office/word/2010/wordprocessingGroup" xmlns:wpi="http://schemas.microsoft.com/office/word/2010/wordprocessingInk" xmlns:wne="http://schemas.microsoft.com/office/word/2006/wordml" xmlns:wps="http://schemas.microsoft.com/office/word/2010/wordprocessingShape" mc:Ignorable="w14 w15 w16se w16cid w16 w16cex w16sdtdh wp14">
+<w:footnotes xmlns:wpc="http://schemas.microsoft.com/office/word/2010/wordprocessingCanvas" xmlns:cx="http://schemas.microsoft.com/office/drawing/2014/chartex" xmlns:cx1="http://schemas.microsoft.com/office/drawing/2015/9/8/chartex" xmlns:cx2="http://schemas.microsoft.com/office/drawing/2015/10/21/chartex" xmlns:cx3="http://schemas.microsoft.com/office/drawing/2016/5/9/chartex" xmlns:cx4="http://schemas.microsoft.com/office/drawing/2016/5/10/chartex" xmlns:cx5="http://schemas.microsoft.com/office/drawing/2016/5/11/chartex" xmlns:cx6="http://schemas.microsoft.com/office/drawing/2016/5/12/chartex" xmlns:cx7="http://schemas.microsoft.com/office/drawing/2016/5/13/chartex" xmlns:cx8="http://schemas.microsoft.com/office/drawing/2016/5/14/chartex" xmlns:mc="http://schemas.openxmlformats.org/markup-compatibility/2006" xmlns:aink="http://schemas.microsoft.com/office/drawing/2016/ink" xmlns:am3d="http://schemas.microsoft.com/office/drawing/2017/model3d" xmlns:o="urn:schemas-microsoft-com:office:office" xmlns:oel="http://schemas.microsoft.com/office/2019/extlst" xmlns:r="http://schemas.openxmlformats.org/officeDocument/2006/relationships" xmlns:m="http://schemas.openxmlformats.org/officeDocument/2006/math" xmlns:v="urn:schemas-microsoft-com:vml" xmlns:wp14="http://schemas.microsoft.com/office/word/2010/wordprocessingDrawing" xmlns:wp="http://schemas.openxmlformats.org/drawingml/2006/wordprocessingDrawing" xmlns:w10="urn:schemas-microsoft-com:office:word" xmlns:w="http://schemas.openxmlformats.org/wordprocessingml/2006/main" xmlns:w14="http://schemas.microsoft.com/office/word/2010/wordml" xmlns:w15="http://schemas.microsoft.com/office/word/2012/wordml" xmlns:w16cex="http://schemas.microsoft.com/office/word/2018/wordml/cex" xmlns:w16cid="http://schemas.microsoft.com/office/word/2016/wordml/cid" xmlns:w16="http://schemas.microsoft.com/office/word/2018/wordml" xmlns:w16du="http://schemas.microsoft.com/office/word/2023/wordml/word16du" xmlns:w16sdtdh="http://schemas.microsoft.com/office/word/2020/wordml/sdtdatahash" xmlns:w16sdtfl="http://schemas.microsoft.com/office/word/2024/wordml/sdtformatlock" xmlns:w16se="http://schemas.microsoft.com/office/word/2015/wordml/symex" xmlns:wpg="http://schemas.microsoft.com/office/word/2010/wordprocessingGroup" xmlns:wpi="http://schemas.microsoft.com/office/word/2010/wordprocessingInk" xmlns:wne="http://schemas.microsoft.com/office/word/2006/wordml" xmlns:wps="http://schemas.microsoft.com/office/word/2010/wordprocessingShape" mc:Ignorable="w14 w15 w16se w16cid w16 w16cex w16sdtdh w16sdtfl w16du wp14">
   <w:footnote w:type="separator" w:id="-1">
     <w:p>
       <w:pPr>
@@ -3054,7 +2842,7 @@
 </file>
 
 <file path=word/header1.xml><?xml version="1.0" encoding="utf-8"?>
-<w:hdr xmlns:wpc="http://schemas.microsoft.com/office/word/2010/wordprocessingCanvas" xmlns:cx="http://schemas.microsoft.com/office/drawing/2014/chartex" xmlns:cx1="http://schemas.microsoft.com/office/drawing/2015/9/8/chartex" xmlns:cx2="http://schemas.microsoft.com/office/drawing/2015/10/21/chartex" xmlns:cx3="http://schemas.microsoft.com/office/drawing/2016/5/9/chartex" xmlns:cx4="http://schemas.microsoft.com/office/drawing/2016/5/10/chartex" xmlns:cx5="http://schemas.microsoft.com/office/drawing/2016/5/11/chartex" xmlns:cx6="http://schemas.microsoft.com/office/drawing/2016/5/12/chartex" xmlns:cx7="http://schemas.microsoft.com/office/drawing/2016/5/13/chartex" xmlns:cx8="http://schemas.microsoft.com/office/drawing/2016/5/14/chartex" xmlns:mc="http://schemas.openxmlformats.org/markup-compatibility/2006" xmlns:aink="http://schemas.microsoft.com/office/drawing/2016/ink" xmlns:am3d="http://schemas.microsoft.com/office/drawing/2017/model3d" xmlns:o="urn:schemas-microsoft-com:office:office" xmlns:oel="http://schemas.microsoft.com/office/2019/extlst" xmlns:r="http://schemas.openxmlformats.org/officeDocument/2006/relationships" xmlns:m="http://schemas.openxmlformats.org/officeDocument/2006/math" xmlns:v="urn:schemas-microsoft-com:vml" xmlns:wp14="http://schemas.microsoft.com/office/word/2010/wordprocessingDrawing" xmlns:wp="http://schemas.openxmlformats.org/drawingml/2006/wordprocessingDrawing" xmlns:w10="urn:schemas-microsoft-com:office:word" xmlns:w="http://schemas.openxmlformats.org/wordprocessingml/2006/main" xmlns:w14="http://schemas.microsoft.com/office/word/2010/wordml" xmlns:w15="http://schemas.microsoft.com/office/word/2012/wordml" xmlns:w16cex="http://schemas.microsoft.com/office/word/2018/wordml/cex" xmlns:w16cid="http://schemas.microsoft.com/office/word/2016/wordml/cid" xmlns:w16="http://schemas.microsoft.com/office/word/2018/wordml" xmlns:w16sdtdh="http://schemas.microsoft.com/office/word/2020/wordml/sdtdatahash" xmlns:w16se="http://schemas.microsoft.com/office/word/2015/wordml/symex" xmlns:wpg="http://schemas.microsoft.com/office/word/2010/wordprocessingGroup" xmlns:wpi="http://schemas.microsoft.com/office/word/2010/wordprocessingInk" xmlns:wne="http://schemas.microsoft.com/office/word/2006/wordml" xmlns:wps="http://schemas.microsoft.com/office/word/2010/wordprocessingShape" mc:Ignorable="w14 w15 w16se w16cid w16 w16cex w16sdtdh wp14">
+<w:hdr xmlns:wpc="http://schemas.microsoft.com/office/word/2010/wordprocessingCanvas" xmlns:cx="http://schemas.microsoft.com/office/drawing/2014/chartex" xmlns:cx1="http://schemas.microsoft.com/office/drawing/2015/9/8/chartex" xmlns:cx2="http://schemas.microsoft.com/office/drawing/2015/10/21/chartex" xmlns:cx3="http://schemas.microsoft.com/office/drawing/2016/5/9/chartex" xmlns:cx4="http://schemas.microsoft.com/office/drawing/2016/5/10/chartex" xmlns:cx5="http://schemas.microsoft.com/office/drawing/2016/5/11/chartex" xmlns:cx6="http://schemas.microsoft.com/office/drawing/2016/5/12/chartex" xmlns:cx7="http://schemas.microsoft.com/office/drawing/2016/5/13/chartex" xmlns:cx8="http://schemas.microsoft.com/office/drawing/2016/5/14/chartex" xmlns:mc="http://schemas.openxmlformats.org/markup-compatibility/2006" xmlns:aink="http://schemas.microsoft.com/office/drawing/2016/ink" xmlns:am3d="http://schemas.microsoft.com/office/drawing/2017/model3d" xmlns:o="urn:schemas-microsoft-com:office:office" xmlns:oel="http://schemas.microsoft.com/office/2019/extlst" xmlns:r="http://schemas.openxmlformats.org/officeDocument/2006/relationships" xmlns:m="http://schemas.openxmlformats.org/officeDocument/2006/math" xmlns:v="urn:schemas-microsoft-com:vml" xmlns:wp14="http://schemas.microsoft.com/office/word/2010/wordprocessingDrawing" xmlns:wp="http://schemas.openxmlformats.org/drawingml/2006/wordprocessingDrawing" xmlns:w10="urn:schemas-microsoft-com:office:word" xmlns:w="http://schemas.openxmlformats.org/wordprocessingml/2006/main" xmlns:w14="http://schemas.microsoft.com/office/word/2010/wordml" xmlns:w15="http://schemas.microsoft.com/office/word/2012/wordml" xmlns:w16cex="http://schemas.microsoft.com/office/word/2018/wordml/cex" xmlns:w16cid="http://schemas.microsoft.com/office/word/2016/wordml/cid" xmlns:w16="http://schemas.microsoft.com/office/word/2018/wordml" xmlns:w16du="http://schemas.microsoft.com/office/word/2023/wordml/word16du" xmlns:w16sdtdh="http://schemas.microsoft.com/office/word/2020/wordml/sdtdatahash" xmlns:w16sdtfl="http://schemas.microsoft.com/office/word/2024/wordml/sdtformatlock" xmlns:w16se="http://schemas.microsoft.com/office/word/2015/wordml/symex" xmlns:wpg="http://schemas.microsoft.com/office/word/2010/wordprocessingGroup" xmlns:wpi="http://schemas.microsoft.com/office/word/2010/wordprocessingInk" xmlns:wne="http://schemas.microsoft.com/office/word/2006/wordml" xmlns:wps="http://schemas.microsoft.com/office/word/2010/wordprocessingShape" mc:Ignorable="w14 w15 w16se w16cid w16 w16cex w16sdtdh w16sdtfl w16du wp14">
   <w:p>
     <w:pPr>
       <w:pStyle w:val="Zhlav"/>
@@ -3204,7 +2992,7 @@
 </file>
 
 <file path=word/styles.xml><?xml version="1.0" encoding="utf-8"?>
-<w:styles xmlns:mc="http://schemas.openxmlformats.org/markup-compatibility/2006" xmlns:r="http://schemas.openxmlformats.org/officeDocument/2006/relationships" xmlns:w="http://schemas.openxmlformats.org/wordprocessingml/2006/main" xmlns:w14="http://schemas.microsoft.com/office/word/2010/wordml" xmlns:w15="http://schemas.microsoft.com/office/word/2012/wordml" xmlns:w16cex="http://schemas.microsoft.com/office/word/2018/wordml/cex" xmlns:w16cid="http://schemas.microsoft.com/office/word/2016/wordml/cid" xmlns:w16="http://schemas.microsoft.com/office/word/2018/wordml" xmlns:w16sdtdh="http://schemas.microsoft.com/office/word/2020/wordml/sdtdatahash" xmlns:w16se="http://schemas.microsoft.com/office/word/2015/wordml/symex" mc:Ignorable="w14 w15 w16se w16cid w16 w16cex w16sdtdh">
+<w:styles xmlns:mc="http://schemas.openxmlformats.org/markup-compatibility/2006" xmlns:r="http://schemas.openxmlformats.org/officeDocument/2006/relationships" xmlns:w="http://schemas.openxmlformats.org/wordprocessingml/2006/main" xmlns:w14="http://schemas.microsoft.com/office/word/2010/wordml" xmlns:w15="http://schemas.microsoft.com/office/word/2012/wordml" xmlns:w16cex="http://schemas.microsoft.com/office/word/2018/wordml/cex" xmlns:w16cid="http://schemas.microsoft.com/office/word/2016/wordml/cid" xmlns:w16="http://schemas.microsoft.com/office/word/2018/wordml" xmlns:w16du="http://schemas.microsoft.com/office/word/2023/wordml/word16du" xmlns:w16sdtdh="http://schemas.microsoft.com/office/word/2020/wordml/sdtdatahash" xmlns:w16sdtfl="http://schemas.microsoft.com/office/word/2024/wordml/sdtformatlock" xmlns:w16se="http://schemas.microsoft.com/office/word/2015/wordml/symex" mc:Ignorable="w14 w15 w16se w16cid w16 w16cex w16sdtdh w16sdtfl w16du">
   <w:docDefaults>
     <w:rPrDefault>
       <w:rPr>

</xml_diff>